<commit_message>
Update final paper files in submission folder
</commit_message>
<xml_diff>
--- a/ES_Divyaraj_23BCE0722/2_Final_Paper/Final_Paper_23BCE0722.docx
+++ b/ES_Divyaraj_23BCE0722/2_Final_Paper/Final_Paper_23BCE0722.docx
@@ -343,11 +343,6 @@
         </w:rPr>
         <w:t xml:space="preserve">@vitstudent.ac.in</w:t>
       </w:r>
-      <w:r>
-        <w:rPr>
-          <w:rtl w:val="0"/>
-        </w:rPr>
-      </w:r>
     </w:p>
     <w:p>
       <w:pPr>
@@ -611,6 +606,7 @@
         </w:numPr>
         <w:tabs>
           <w:tab w:val="left" w:leader="none" w:pos="216"/>
+          <w:tab w:val="left" w:leader="none" w:pos="216"/>
         </w:tabs>
         <w:ind w:left="0" w:firstLine="216"/>
         <w:rPr/>
@@ -643,6 +639,7 @@
         </w:numPr>
         <w:tabs>
           <w:tab w:val="left" w:leader="none" w:pos="216"/>
+          <w:tab w:val="left" w:leader="none" w:pos="216"/>
         </w:tabs>
         <w:ind w:left="0" w:firstLine="216"/>
         <w:rPr/>
@@ -656,6 +653,7 @@
     </w:p>
     <w:p>
       <w:pPr>
+        <w:keepLines w:val="1"/>
         <w:jc w:val="both"/>
         <w:rPr/>
       </w:pPr>
@@ -668,6 +666,7 @@
     </w:p>
     <w:p>
       <w:pPr>
+        <w:keepLines w:val="1"/>
         <w:jc w:val="both"/>
         <w:rPr/>
       </w:pPr>
@@ -675,10 +674,12 @@
         <w:rPr>
           <w:rtl w:val="0"/>
         </w:rPr>
-      </w:r>
-    </w:p>
-    <w:p>
-      <w:pPr>
+        <w:t xml:space="preserve">• To implement WHO-compliant temperature thresholds ensuring regulatory transparency and auditability for pharmaceutical logistics</w:t>
+      </w:r>
+    </w:p>
+    <w:p>
+      <w:pPr>
+        <w:keepLines w:val="1"/>
         <w:jc w:val="both"/>
         <w:rPr/>
       </w:pPr>
@@ -686,11 +687,12 @@
         <w:rPr>
           <w:rtl w:val="0"/>
         </w:rPr>
-        <w:t xml:space="preserve">• To implement WHO-compliant temperature thresholds ensuring regulatory transparency and auditability for pharmaceutical logistics</w:t>
-      </w:r>
-    </w:p>
-    <w:p>
-      <w:pPr>
+        <w:t xml:space="preserve">• To deploy a lightweight neural network (344 bytes) on ESP32 for real-time vibration pattern classification without cloud dependency</w:t>
+      </w:r>
+    </w:p>
+    <w:p>
+      <w:pPr>
+        <w:keepLines w:val="1"/>
         <w:jc w:val="both"/>
         <w:rPr/>
       </w:pPr>
@@ -698,46 +700,7 @@
         <w:rPr>
           <w:rtl w:val="0"/>
         </w:rPr>
-      </w:r>
-    </w:p>
-    <w:p>
-      <w:pPr>
-        <w:jc w:val="both"/>
-        <w:rPr/>
-      </w:pPr>
-      <w:r>
-        <w:rPr>
-          <w:rtl w:val="0"/>
-        </w:rPr>
-        <w:t xml:space="preserve">• To deploy a lightweight neural network (344 bytes) on ESP32 for real-time vibration pattern classification without cloud dependency</w:t>
-      </w:r>
-    </w:p>
-    <w:p>
-      <w:pPr>
-        <w:jc w:val="both"/>
-        <w:rPr/>
-      </w:pPr>
-      <w:r>
-        <w:rPr>
-          <w:rtl w:val="0"/>
-        </w:rPr>
-      </w:r>
-    </w:p>
-    <w:p>
-      <w:pPr>
-        <w:jc w:val="both"/>
-        <w:rPr/>
-      </w:pPr>
-      <w:r>
-        <w:rPr>
-          <w:rtl w:val="0"/>
-        </w:rPr>
         <w:t xml:space="preserve">• To provide immediate multi-modal alerts (visual, auditory, display) enabling rapid intervention during transport anomalies</w:t>
-      </w:r>
-      <w:r>
-        <w:rPr>
-          <w:rtl w:val="0"/>
-        </w:rPr>
       </w:r>
     </w:p>
     <w:p>
@@ -749,6 +712,7 @@
         </w:numPr>
         <w:tabs>
           <w:tab w:val="left" w:leader="none" w:pos="216"/>
+          <w:tab w:val="left" w:leader="none" w:pos="216"/>
         </w:tabs>
         <w:ind w:left="0" w:firstLine="216"/>
         <w:rPr/>
@@ -781,6 +745,7 @@
         <w:rPr>
           <w:rtl w:val="0"/>
         </w:rPr>
+        <w:t xml:space="preserve">• MPU6050 accelerometer captures 3-axis acceleration data at 20Hz, with feature extraction computing magnitude, jerk, variance, peak frequency, and zero-crossings</w:t>
       </w:r>
     </w:p>
     <w:p>
@@ -792,7 +757,7 @@
         <w:rPr>
           <w:rtl w:val="0"/>
         </w:rPr>
-        <w:t xml:space="preserve">• MPU6050 accelerometer captures 3-axis acceleration data at 20Hz, with feature extraction computing magnitude, jerk, variance, peak frequency, and zero-crossings</w:t>
+        <w:t xml:space="preserve">• TinyML neural network processes extracted features to classify vibration patterns into Normal Transport, Impact, Rough Handling, or Stationary states</w:t>
       </w:r>
     </w:p>
     <w:p>
@@ -804,52 +769,7 @@
         <w:rPr>
           <w:rtl w:val="0"/>
         </w:rPr>
-      </w:r>
-    </w:p>
-    <w:p>
-      <w:pPr>
-        <w:jc w:val="left"/>
-        <w:rPr/>
-      </w:pPr>
-      <w:r>
-        <w:rPr>
-          <w:rtl w:val="0"/>
-        </w:rPr>
-        <w:t xml:space="preserve">• TinyML neural network processes extracted features to classify vibration patterns into Normal Transport, Impact, Rough Handling, or Stationary states</w:t>
-      </w:r>
-    </w:p>
-    <w:p>
-      <w:pPr>
-        <w:jc w:val="left"/>
-        <w:rPr/>
-      </w:pPr>
-      <w:r>
-        <w:rPr>
-          <w:rtl w:val="0"/>
-        </w:rPr>
-      </w:r>
-    </w:p>
-    <w:p>
-      <w:pPr>
-        <w:jc w:val="left"/>
-        <w:rPr/>
-      </w:pPr>
-      <w:r>
-        <w:rPr>
-          <w:rtl w:val="0"/>
-        </w:rPr>
         <w:t xml:space="preserve">• Multi-level alert system activates appropriate indicators based on combined temperature and impact status assessment</w:t>
-      </w:r>
-    </w:p>
-    <w:p>
-      <w:pPr>
-        <w:jc w:val="left"/>
-        <w:rPr/>
-      </w:pPr>
-      <w:r>
-        <w:rPr>
-          <w:rtl w:val="0"/>
-        </w:rPr>
       </w:r>
     </w:p>
     <w:p>
@@ -883,6 +803,7 @@
           <w:numId w:val="1"/>
         </w:numPr>
         <w:tabs>
+          <w:tab w:val="left" w:leader="none" w:pos="216"/>
           <w:tab w:val="left" w:leader="none" w:pos="216"/>
         </w:tabs>
         <w:ind w:left="0" w:firstLine="216"/>
@@ -949,7 +870,7 @@
               <wp:anchor allowOverlap="1" behindDoc="0" distB="57150" distT="57150" distL="57150" distR="57150" hidden="0" layoutInCell="1" locked="0" relativeHeight="0" simplePos="0">
                 <wp:simplePos x="0" y="0"/>
                 <wp:positionH relativeFrom="column">
-                  <wp:posOffset>-9524</wp:posOffset>
+                  <wp:posOffset>-9523</wp:posOffset>
                 </wp:positionH>
                 <wp:positionV relativeFrom="paragraph">
                   <wp:posOffset>2764319</wp:posOffset>
@@ -957,86 +878,128 @@
                 <wp:extent cx="3209925" cy="1410559"/>
                 <wp:effectExtent b="0" l="0" r="0" t="0"/>
                 <wp:wrapSquare wrapText="bothSides" distB="57150" distT="57150" distL="57150" distR="57150"/>
-                <wp:docPr id="4" name=""/>
+                <wp:docPr id="2" name=""/>
                 <a:graphic>
                   <a:graphicData uri="http://schemas.microsoft.com/office/word/2010/wordprocessingGroup">
                     <wpg:wgp>
                       <wpg:cNvGrpSpPr/>
                       <wpg:grpSpPr>
                         <a:xfrm>
-                          <a:off x="3741025" y="3203725"/>
+                          <a:off x="3739950" y="3073625"/>
                           <a:ext cx="3209925" cy="1410559"/>
-                          <a:chOff x="3741025" y="3203725"/>
-                          <a:chExt cx="4162450" cy="1828750"/>
+                          <a:chOff x="3739950" y="3073625"/>
+                          <a:chExt cx="3212100" cy="1412750"/>
                         </a:xfrm>
                       </wpg:grpSpPr>
-                      <wps:wsp>
-                        <wps:cNvSpPr/>
-                        <wps:cNvPr id="2" name="Shape 2"/>
-                        <wps:spPr>
+                      <wpg:grpSp>
+                        <wpg:cNvGrpSpPr/>
+                        <wpg:grpSpPr>
                           <a:xfrm>
-                            <a:off x="3745800" y="3208500"/>
-                            <a:ext cx="4152900" cy="1819200"/>
+                            <a:off x="3741038" y="3074721"/>
+                            <a:ext cx="3209925" cy="1410559"/>
+                            <a:chOff x="3741025" y="3203725"/>
+                            <a:chExt cx="4162450" cy="1828750"/>
                           </a:xfrm>
-                          <a:prstGeom prst="rect">
-                            <a:avLst/>
-                          </a:prstGeom>
-                          <a:solidFill>
-                            <a:srgbClr val="FFFFFF"/>
-                          </a:solidFill>
-                          <a:ln cap="flat" cmpd="sng" w="9525">
+                        </wpg:grpSpPr>
+                        <wps:wsp>
+                          <wps:cNvSpPr/>
+                          <wps:cNvPr id="3" name="Shape 3"/>
+                          <wps:spPr>
+                            <a:xfrm>
+                              <a:off x="3741025" y="3203725"/>
+                              <a:ext cx="4162450" cy="1828750"/>
+                            </a:xfrm>
+                            <a:prstGeom prst="rect">
+                              <a:avLst/>
+                            </a:prstGeom>
+                            <a:noFill/>
+                            <a:ln>
+                              <a:noFill/>
+                            </a:ln>
+                          </wps:spPr>
+                          <wps:txbx>
+                            <w:txbxContent>
+                              <w:p>
+                                <w:pPr>
+                                  <w:spacing w:after="0" w:before="0" w:line="240"/>
+                                  <w:ind w:left="0" w:right="0" w:firstLine="0"/>
+                                  <w:jc w:val="left"/>
+                                  <w:textDirection w:val="btLr"/>
+                                </w:pPr>
+                              </w:p>
+                            </w:txbxContent>
+                          </wps:txbx>
+                          <wps:bodyPr anchorCtr="0" anchor="ctr" bIns="91425" lIns="91425" spcFirstLastPara="1" rIns="91425" wrap="square" tIns="91425">
+                            <a:noAutofit/>
+                          </wps:bodyPr>
+                        </wps:wsp>
+                        <wps:wsp>
+                          <wps:cNvSpPr/>
+                          <wps:cNvPr id="7" name="Shape 7"/>
+                          <wps:spPr>
+                            <a:xfrm>
+                              <a:off x="3745800" y="3208500"/>
+                              <a:ext cx="4152900" cy="1819200"/>
+                            </a:xfrm>
+                            <a:prstGeom prst="rect">
+                              <a:avLst/>
+                            </a:prstGeom>
                             <a:solidFill>
-                              <a:srgbClr val="000000"/>
+                              <a:srgbClr val="FFFFFF"/>
                             </a:solidFill>
-                            <a:prstDash val="solid"/>
-                            <a:miter lim="800000"/>
-                            <a:headEnd len="sm" w="sm" type="none"/>
-                            <a:tailEnd len="sm" w="sm" type="none"/>
-                          </a:ln>
-                        </wps:spPr>
-                        <wps:txbx>
-                          <w:txbxContent>
-                            <w:p>
-                              <w:pPr>
-                                <w:spacing w:after="120" w:before="0" w:line="227.99999713897705"/>
-                                <w:ind w:left="0" w:right="0" w:firstLine="287.99999237060547"/>
-                                <w:jc w:val="both"/>
-                                <w:textDirection w:val="btLr"/>
-                              </w:pPr>
-                            </w:p>
-                          </w:txbxContent>
-                        </wps:txbx>
-                        <wps:bodyPr anchorCtr="0" anchor="t" bIns="45700" lIns="91425" spcFirstLastPara="1" rIns="91425" wrap="square" tIns="45700">
-                          <a:noAutofit/>
-                        </wps:bodyPr>
-                      </wps:wsp>
-                      <pic:pic>
-                        <pic:nvPicPr>
-                          <pic:cNvPr id="6" name="Shape 6"/>
-                          <pic:cNvPicPr preferRelativeResize="0"/>
-                        </pic:nvPicPr>
-                        <pic:blipFill>
-                          <a:blip r:embed="rId7">
-                            <a:alphaModFix/>
-                          </a:blip>
-                          <a:stretch>
-                            <a:fillRect/>
-                          </a:stretch>
-                        </pic:blipFill>
-                        <pic:spPr>
-                          <a:xfrm>
-                            <a:off x="3745800" y="3208500"/>
-                            <a:ext cx="4152900" cy="1819275"/>
-                          </a:xfrm>
-                          <a:prstGeom prst="rect">
-                            <a:avLst/>
-                          </a:prstGeom>
-                          <a:noFill/>
-                          <a:ln>
+                            <a:ln cap="flat" cmpd="sng" w="9525">
+                              <a:solidFill>
+                                <a:srgbClr val="000000"/>
+                              </a:solidFill>
+                              <a:prstDash val="solid"/>
+                              <a:miter lim="800000"/>
+                              <a:headEnd len="sm" w="sm" type="none"/>
+                              <a:tailEnd len="sm" w="sm" type="none"/>
+                            </a:ln>
+                          </wps:spPr>
+                          <wps:txbx>
+                            <w:txbxContent>
+                              <w:p>
+                                <w:pPr>
+                                  <w:spacing w:after="120" w:before="0" w:line="227.99999713897705"/>
+                                  <w:ind w:left="0" w:right="0" w:firstLine="287.99999237060547"/>
+                                  <w:jc w:val="both"/>
+                                  <w:textDirection w:val="btLr"/>
+                                </w:pPr>
+                              </w:p>
+                            </w:txbxContent>
+                          </wps:txbx>
+                          <wps:bodyPr anchorCtr="0" anchor="t" bIns="45700" lIns="91425" spcFirstLastPara="1" rIns="91425" wrap="square" tIns="45700">
+                            <a:noAutofit/>
+                          </wps:bodyPr>
+                        </wps:wsp>
+                        <pic:pic>
+                          <pic:nvPicPr>
+                            <pic:cNvPr id="8" name="Shape 8"/>
+                            <pic:cNvPicPr preferRelativeResize="0"/>
+                          </pic:nvPicPr>
+                          <pic:blipFill rotWithShape="1">
+                            <a:blip r:embed="rId7">
+                              <a:alphaModFix/>
+                            </a:blip>
+                            <a:srcRect b="0" l="0" r="0" t="0"/>
+                            <a:stretch/>
+                          </pic:blipFill>
+                          <pic:spPr>
+                            <a:xfrm>
+                              <a:off x="3745800" y="3208500"/>
+                              <a:ext cx="4152900" cy="1819275"/>
+                            </a:xfrm>
+                            <a:prstGeom prst="rect">
+                              <a:avLst/>
+                            </a:prstGeom>
                             <a:noFill/>
-                          </a:ln>
-                        </pic:spPr>
-                      </pic:pic>
+                            <a:ln>
+                              <a:noFill/>
+                            </a:ln>
+                          </pic:spPr>
+                        </pic:pic>
+                      </wpg:grpSp>
                     </wpg:wgp>
                   </a:graphicData>
                 </a:graphic>
@@ -1048,7 +1011,7 @@
               <wp:anchor allowOverlap="1" behindDoc="0" distB="57150" distT="57150" distL="57150" distR="57150" hidden="0" layoutInCell="1" locked="0" relativeHeight="0" simplePos="0">
                 <wp:simplePos x="0" y="0"/>
                 <wp:positionH relativeFrom="column">
-                  <wp:posOffset>-9524</wp:posOffset>
+                  <wp:posOffset>-9523</wp:posOffset>
                 </wp:positionH>
                 <wp:positionV relativeFrom="paragraph">
                   <wp:posOffset>2764319</wp:posOffset>
@@ -1056,12 +1019,12 @@
                 <wp:extent cx="3209925" cy="1410559"/>
                 <wp:effectExtent b="0" l="0" r="0" t="0"/>
                 <wp:wrapSquare wrapText="bothSides" distB="57150" distT="57150" distL="57150" distR="57150"/>
-                <wp:docPr id="4" name="image4.png"/>
+                <wp:docPr id="2" name="image2.png"/>
                 <a:graphic>
                   <a:graphicData uri="http://schemas.openxmlformats.org/drawingml/2006/picture">
                     <pic:pic>
                       <pic:nvPicPr>
-                        <pic:cNvPr id="0" name="image4.png"/>
+                        <pic:cNvPr id="0" name="image2.png"/>
                         <pic:cNvPicPr preferRelativeResize="0"/>
                       </pic:nvPicPr>
                       <pic:blipFill>
@@ -1129,6 +1092,7 @@
         </w:numPr>
         <w:tabs>
           <w:tab w:val="left" w:leader="none" w:pos="216"/>
+          <w:tab w:val="left" w:leader="none" w:pos="216"/>
         </w:tabs>
         <w:ind w:left="0" w:firstLine="216"/>
         <w:rPr/>
@@ -1151,11 +1115,6 @@
         </w:rPr>
         <w:t xml:space="preserve">The circuit diagram in Figure 2 shows the hardware configuration implemented in the Wokwi simulation environment. The ESP32 DevKit V1 serves as the central processing unit, interfacing with an MPU6050 accelerometer and LCD1602 display via I2C bus (GPIO21-SDA, GPIO22-SCL). Two potentiometers connected to ADC pins (GPIO34, GPIO35) simulate internal and ambient temperature sensors. Three LEDs with 220Ω current-limiting resistors connect to GPIO25 (green), GPIO26 (yellow), and GPIO27 (red) for status indication. A piezoelectric buzzer on GPIO18 provides auditory alerts, while a push button on GPIO12 simulates door open/close events for testing thermal dynamics.</w:t>
       </w:r>
-      <w:r>
-        <w:rPr>
-          <w:rtl w:val="0"/>
-        </w:rPr>
-      </w:r>
     </w:p>
     <w:p>
       <w:pPr>
@@ -1172,6 +1131,7 @@
       <w:pPr>
         <w:pStyle w:val="Heading1"/>
         <w:tabs>
+          <w:tab w:val="left" w:leader="none" w:pos="216"/>
           <w:tab w:val="left" w:leader="none" w:pos="216"/>
         </w:tabs>
         <w:jc w:val="both"/>
@@ -1189,7 +1149,7 @@
               <wp:anchor allowOverlap="1" behindDoc="0" distB="0" distT="0" distL="114300" distR="114300" hidden="0" layoutInCell="1" locked="0" relativeHeight="0" simplePos="0">
                 <wp:simplePos x="0" y="0"/>
                 <wp:positionH relativeFrom="column">
-                  <wp:posOffset>-9524</wp:posOffset>
+                  <wp:posOffset>-9523</wp:posOffset>
                 </wp:positionH>
                 <wp:positionV relativeFrom="paragraph">
                   <wp:posOffset>104775</wp:posOffset>
@@ -1204,79 +1164,121 @@
                       <wpg:cNvGrpSpPr/>
                       <wpg:grpSpPr>
                         <a:xfrm>
-                          <a:off x="2150400" y="935450"/>
+                          <a:off x="3712150" y="2928000"/>
                           <a:ext cx="3264425" cy="1700741"/>
-                          <a:chOff x="2150400" y="935450"/>
-                          <a:chExt cx="4982350" cy="2589850"/>
+                          <a:chOff x="3712150" y="2928000"/>
+                          <a:chExt cx="3267700" cy="1704000"/>
                         </a:xfrm>
                       </wpg:grpSpPr>
-                      <wps:wsp>
-                        <wps:cNvSpPr/>
-                        <wps:cNvPr id="2" name="Shape 2"/>
-                        <wps:spPr>
+                      <wpg:grpSp>
+                        <wpg:cNvGrpSpPr/>
+                        <wpg:grpSpPr>
                           <a:xfrm>
-                            <a:off x="2155175" y="940225"/>
-                            <a:ext cx="4972800" cy="2580300"/>
+                            <a:off x="3713788" y="2929630"/>
+                            <a:ext cx="3264425" cy="1700741"/>
+                            <a:chOff x="2150400" y="935450"/>
+                            <a:chExt cx="4982350" cy="2589850"/>
                           </a:xfrm>
-                          <a:prstGeom prst="rect">
-                            <a:avLst/>
-                          </a:prstGeom>
-                          <a:solidFill>
-                            <a:srgbClr val="FFFFFF"/>
-                          </a:solidFill>
-                          <a:ln cap="flat" cmpd="sng" w="9525">
+                        </wpg:grpSpPr>
+                        <wps:wsp>
+                          <wps:cNvSpPr/>
+                          <wps:cNvPr id="3" name="Shape 3"/>
+                          <wps:spPr>
+                            <a:xfrm>
+                              <a:off x="2150400" y="935450"/>
+                              <a:ext cx="4982350" cy="2589850"/>
+                            </a:xfrm>
+                            <a:prstGeom prst="rect">
+                              <a:avLst/>
+                            </a:prstGeom>
+                            <a:noFill/>
+                            <a:ln>
+                              <a:noFill/>
+                            </a:ln>
+                          </wps:spPr>
+                          <wps:txbx>
+                            <w:txbxContent>
+                              <w:p>
+                                <w:pPr>
+                                  <w:spacing w:after="0" w:before="0" w:line="240"/>
+                                  <w:ind w:left="0" w:right="0" w:firstLine="0"/>
+                                  <w:jc w:val="left"/>
+                                  <w:textDirection w:val="btLr"/>
+                                </w:pPr>
+                              </w:p>
+                            </w:txbxContent>
+                          </wps:txbx>
+                          <wps:bodyPr anchorCtr="0" anchor="ctr" bIns="91425" lIns="91425" spcFirstLastPara="1" rIns="91425" wrap="square" tIns="91425">
+                            <a:noAutofit/>
+                          </wps:bodyPr>
+                        </wps:wsp>
+                        <wps:wsp>
+                          <wps:cNvSpPr/>
+                          <wps:cNvPr id="4" name="Shape 4"/>
+                          <wps:spPr>
+                            <a:xfrm>
+                              <a:off x="2155175" y="940225"/>
+                              <a:ext cx="4972800" cy="2580300"/>
+                            </a:xfrm>
+                            <a:prstGeom prst="rect">
+                              <a:avLst/>
+                            </a:prstGeom>
                             <a:solidFill>
-                              <a:srgbClr val="000000"/>
+                              <a:srgbClr val="FFFFFF"/>
                             </a:solidFill>
-                            <a:prstDash val="solid"/>
-                            <a:miter lim="800000"/>
-                            <a:headEnd len="sm" w="sm" type="none"/>
-                            <a:tailEnd len="sm" w="sm" type="none"/>
-                          </a:ln>
-                        </wps:spPr>
-                        <wps:txbx>
-                          <w:txbxContent>
-                            <w:p>
-                              <w:pPr>
-                                <w:spacing w:after="120" w:before="0" w:line="227.99999713897705"/>
-                                <w:ind w:left="0" w:right="0" w:firstLine="287.99999237060547"/>
-                                <w:jc w:val="both"/>
-                                <w:textDirection w:val="btLr"/>
-                              </w:pPr>
-                            </w:p>
-                          </w:txbxContent>
-                        </wps:txbx>
-                        <wps:bodyPr anchorCtr="0" anchor="t" bIns="45700" lIns="91425" spcFirstLastPara="1" rIns="91425" wrap="square" tIns="45700">
-                          <a:noAutofit/>
-                        </wps:bodyPr>
-                      </wps:wsp>
-                      <pic:pic>
-                        <pic:nvPicPr>
-                          <pic:cNvPr id="3" name="Shape 3"/>
-                          <pic:cNvPicPr preferRelativeResize="0"/>
-                        </pic:nvPicPr>
-                        <pic:blipFill>
-                          <a:blip r:embed="rId9">
-                            <a:alphaModFix/>
-                          </a:blip>
-                          <a:stretch>
-                            <a:fillRect/>
-                          </a:stretch>
-                        </pic:blipFill>
-                        <pic:spPr>
-                          <a:xfrm>
-                            <a:off x="2155175" y="940225"/>
-                            <a:ext cx="4972800" cy="2580177"/>
-                          </a:xfrm>
-                          <a:prstGeom prst="rect">
-                            <a:avLst/>
-                          </a:prstGeom>
-                          <a:noFill/>
-                          <a:ln>
+                            <a:ln cap="flat" cmpd="sng" w="9525">
+                              <a:solidFill>
+                                <a:srgbClr val="000000"/>
+                              </a:solidFill>
+                              <a:prstDash val="solid"/>
+                              <a:miter lim="800000"/>
+                              <a:headEnd len="sm" w="sm" type="none"/>
+                              <a:tailEnd len="sm" w="sm" type="none"/>
+                            </a:ln>
+                          </wps:spPr>
+                          <wps:txbx>
+                            <w:txbxContent>
+                              <w:p>
+                                <w:pPr>
+                                  <w:spacing w:after="120" w:before="0" w:line="227.99999713897705"/>
+                                  <w:ind w:left="0" w:right="0" w:firstLine="287.99999237060547"/>
+                                  <w:jc w:val="both"/>
+                                  <w:textDirection w:val="btLr"/>
+                                </w:pPr>
+                              </w:p>
+                            </w:txbxContent>
+                          </wps:txbx>
+                          <wps:bodyPr anchorCtr="0" anchor="t" bIns="45700" lIns="91425" spcFirstLastPara="1" rIns="91425" wrap="square" tIns="45700">
+                            <a:noAutofit/>
+                          </wps:bodyPr>
+                        </wps:wsp>
+                        <pic:pic>
+                          <pic:nvPicPr>
+                            <pic:cNvPr id="5" name="Shape 5"/>
+                            <pic:cNvPicPr preferRelativeResize="0"/>
+                          </pic:nvPicPr>
+                          <pic:blipFill rotWithShape="1">
+                            <a:blip r:embed="rId9">
+                              <a:alphaModFix/>
+                            </a:blip>
+                            <a:srcRect b="0" l="0" r="0" t="0"/>
+                            <a:stretch/>
+                          </pic:blipFill>
+                          <pic:spPr>
+                            <a:xfrm>
+                              <a:off x="2155175" y="940225"/>
+                              <a:ext cx="4972800" cy="2580177"/>
+                            </a:xfrm>
+                            <a:prstGeom prst="rect">
+                              <a:avLst/>
+                            </a:prstGeom>
                             <a:noFill/>
-                          </a:ln>
-                        </pic:spPr>
-                      </pic:pic>
+                            <a:ln>
+                              <a:noFill/>
+                            </a:ln>
+                          </pic:spPr>
+                        </pic:pic>
+                      </wpg:grpSp>
                     </wpg:wgp>
                   </a:graphicData>
                 </a:graphic>
@@ -1288,7 +1290,7 @@
               <wp:anchor allowOverlap="1" behindDoc="0" distB="0" distT="0" distL="114300" distR="114300" hidden="0" layoutInCell="1" locked="0" relativeHeight="0" simplePos="0">
                 <wp:simplePos x="0" y="0"/>
                 <wp:positionH relativeFrom="column">
-                  <wp:posOffset>-9524</wp:posOffset>
+                  <wp:posOffset>-9523</wp:posOffset>
                 </wp:positionH>
                 <wp:positionV relativeFrom="paragraph">
                   <wp:posOffset>104775</wp:posOffset>
@@ -1348,11 +1350,6 @@
         </w:rPr>
         <w:t xml:space="preserve">Fig. 2. Circuit diagram implemented in Wokwi simulator showing ESP32 DevKit V1 interfaced with MPU6050 accelerometer (I2C), LCD1602 display (I2C), two potentiometers (ADC - temperature simulation), three status LEDs (Green/Yellow/Red), piezoelectric buzzer, and door simulation button.</w:t>
       </w:r>
-      <w:r>
-        <w:rPr>
-          <w:rtl w:val="0"/>
-        </w:rPr>
-      </w:r>
     </w:p>
     <w:p>
       <w:pPr>
@@ -1487,6 +1484,7 @@
         </w:numPr>
         <w:tabs>
           <w:tab w:val="left" w:leader="none" w:pos="216"/>
+          <w:tab w:val="left" w:leader="none" w:pos="216"/>
         </w:tabs>
         <w:ind w:left="0" w:firstLine="216"/>
         <w:rPr/>
@@ -1496,11 +1494,6 @@
           <w:rtl w:val="0"/>
         </w:rPr>
         <w:t xml:space="preserve">Flow chart</w:t>
-      </w:r>
-      <w:r>
-        <w:rPr>
-          <w:rtl w:val="0"/>
-        </w:rPr>
       </w:r>
     </w:p>
     <w:p>
@@ -1519,7 +1512,7 @@
               <wp:anchor allowOverlap="1" behindDoc="0" distB="0" distT="0" distL="114300" distR="114300" hidden="0" layoutInCell="1" locked="0" relativeHeight="0" simplePos="0">
                 <wp:simplePos x="0" y="0"/>
                 <wp:positionH relativeFrom="column">
-                  <wp:posOffset>57151</wp:posOffset>
+                  <wp:posOffset>57152</wp:posOffset>
                 </wp:positionH>
                 <wp:positionV relativeFrom="paragraph">
                   <wp:posOffset>123825</wp:posOffset>
@@ -1527,86 +1520,128 @@
                 <wp:extent cx="3209925" cy="8223615"/>
                 <wp:effectExtent b="0" l="0" r="0" t="0"/>
                 <wp:wrapNone/>
-                <wp:docPr id="2" name=""/>
+                <wp:docPr id="4" name=""/>
                 <a:graphic>
                   <a:graphicData uri="http://schemas.microsoft.com/office/word/2010/wordprocessingGroup">
                     <wpg:wgp>
                       <wpg:cNvGrpSpPr/>
                       <wpg:grpSpPr>
                         <a:xfrm>
-                          <a:off x="3628075" y="126000"/>
+                          <a:off x="3741025" y="0"/>
                           <a:ext cx="3209925" cy="8223615"/>
-                          <a:chOff x="3628075" y="126000"/>
-                          <a:chExt cx="2836450" cy="7281625"/>
+                          <a:chOff x="3741025" y="0"/>
+                          <a:chExt cx="3209950" cy="7560000"/>
                         </a:xfrm>
                       </wpg:grpSpPr>
-                      <wps:wsp>
-                        <wps:cNvSpPr/>
-                        <wps:cNvPr id="2" name="Shape 2"/>
-                        <wps:spPr>
+                      <wpg:grpSp>
+                        <wpg:cNvGrpSpPr/>
+                        <wpg:grpSpPr>
                           <a:xfrm>
-                            <a:off x="3632850" y="130775"/>
-                            <a:ext cx="2826900" cy="7193700"/>
+                            <a:off x="3741038" y="0"/>
+                            <a:ext cx="3209925" cy="7560000"/>
+                            <a:chOff x="3628075" y="126000"/>
+                            <a:chExt cx="2836450" cy="7281625"/>
                           </a:xfrm>
-                          <a:prstGeom prst="rect">
-                            <a:avLst/>
-                          </a:prstGeom>
-                          <a:solidFill>
-                            <a:srgbClr val="FFFFFF"/>
-                          </a:solidFill>
-                          <a:ln cap="flat" cmpd="sng" w="9525">
+                        </wpg:grpSpPr>
+                        <wps:wsp>
+                          <wps:cNvSpPr/>
+                          <wps:cNvPr id="3" name="Shape 3"/>
+                          <wps:spPr>
+                            <a:xfrm>
+                              <a:off x="3628075" y="126000"/>
+                              <a:ext cx="2836450" cy="7281625"/>
+                            </a:xfrm>
+                            <a:prstGeom prst="rect">
+                              <a:avLst/>
+                            </a:prstGeom>
+                            <a:noFill/>
+                            <a:ln>
+                              <a:noFill/>
+                            </a:ln>
+                          </wps:spPr>
+                          <wps:txbx>
+                            <w:txbxContent>
+                              <w:p>
+                                <w:pPr>
+                                  <w:spacing w:after="0" w:before="0" w:line="240"/>
+                                  <w:ind w:left="0" w:right="0" w:firstLine="0"/>
+                                  <w:jc w:val="left"/>
+                                  <w:textDirection w:val="btLr"/>
+                                </w:pPr>
+                              </w:p>
+                            </w:txbxContent>
+                          </wps:txbx>
+                          <wps:bodyPr anchorCtr="0" anchor="ctr" bIns="91425" lIns="91425" spcFirstLastPara="1" rIns="91425" wrap="square" tIns="91425">
+                            <a:noAutofit/>
+                          </wps:bodyPr>
+                        </wps:wsp>
+                        <wps:wsp>
+                          <wps:cNvSpPr/>
+                          <wps:cNvPr id="13" name="Shape 13"/>
+                          <wps:spPr>
+                            <a:xfrm>
+                              <a:off x="3632850" y="130775"/>
+                              <a:ext cx="2826900" cy="7193700"/>
+                            </a:xfrm>
+                            <a:prstGeom prst="rect">
+                              <a:avLst/>
+                            </a:prstGeom>
                             <a:solidFill>
-                              <a:srgbClr val="000000"/>
+                              <a:srgbClr val="FFFFFF"/>
                             </a:solidFill>
-                            <a:prstDash val="solid"/>
-                            <a:miter lim="800000"/>
-                            <a:headEnd len="sm" w="sm" type="none"/>
-                            <a:tailEnd len="sm" w="sm" type="none"/>
-                          </a:ln>
-                        </wps:spPr>
-                        <wps:txbx>
-                          <w:txbxContent>
-                            <w:p>
-                              <w:pPr>
-                                <w:spacing w:after="120" w:before="0" w:line="227.99999713897705"/>
-                                <w:ind w:left="0" w:right="0" w:firstLine="287.99999237060547"/>
-                                <w:jc w:val="both"/>
-                                <w:textDirection w:val="btLr"/>
-                              </w:pPr>
-                            </w:p>
-                          </w:txbxContent>
-                        </wps:txbx>
-                        <wps:bodyPr anchorCtr="0" anchor="t" bIns="45700" lIns="91425" spcFirstLastPara="1" rIns="91425" wrap="square" tIns="45700">
-                          <a:noAutofit/>
-                        </wps:bodyPr>
-                      </wps:wsp>
-                      <pic:pic>
-                        <pic:nvPicPr>
-                          <pic:cNvPr id="4" name="Shape 4" title="IoT Image Processing-2026-04-08-074312.png"/>
-                          <pic:cNvPicPr preferRelativeResize="0"/>
-                        </pic:nvPicPr>
-                        <pic:blipFill>
-                          <a:blip r:embed="rId10">
-                            <a:alphaModFix/>
-                          </a:blip>
-                          <a:stretch>
-                            <a:fillRect/>
-                          </a:stretch>
-                        </pic:blipFill>
-                        <pic:spPr>
-                          <a:xfrm>
-                            <a:off x="3632850" y="152400"/>
-                            <a:ext cx="2826979" cy="7255204"/>
-                          </a:xfrm>
-                          <a:prstGeom prst="rect">
-                            <a:avLst/>
-                          </a:prstGeom>
-                          <a:noFill/>
-                          <a:ln>
+                            <a:ln cap="flat" cmpd="sng" w="9525">
+                              <a:solidFill>
+                                <a:srgbClr val="000000"/>
+                              </a:solidFill>
+                              <a:prstDash val="solid"/>
+                              <a:miter lim="800000"/>
+                              <a:headEnd len="sm" w="sm" type="none"/>
+                              <a:tailEnd len="sm" w="sm" type="none"/>
+                            </a:ln>
+                          </wps:spPr>
+                          <wps:txbx>
+                            <w:txbxContent>
+                              <w:p>
+                                <w:pPr>
+                                  <w:spacing w:after="120" w:before="0" w:line="227.99999713897705"/>
+                                  <w:ind w:left="0" w:right="0" w:firstLine="287.99999237060547"/>
+                                  <w:jc w:val="both"/>
+                                  <w:textDirection w:val="btLr"/>
+                                </w:pPr>
+                              </w:p>
+                            </w:txbxContent>
+                          </wps:txbx>
+                          <wps:bodyPr anchorCtr="0" anchor="t" bIns="45700" lIns="91425" spcFirstLastPara="1" rIns="91425" wrap="square" tIns="45700">
+                            <a:noAutofit/>
+                          </wps:bodyPr>
+                        </wps:wsp>
+                        <pic:pic>
+                          <pic:nvPicPr>
+                            <pic:cNvPr id="14" name="Shape 14" title="IoT Image Processing-2026-04-08-074312.png"/>
+                            <pic:cNvPicPr preferRelativeResize="0"/>
+                          </pic:nvPicPr>
+                          <pic:blipFill rotWithShape="1">
+                            <a:blip r:embed="rId10">
+                              <a:alphaModFix/>
+                            </a:blip>
+                            <a:srcRect b="0" l="0" r="0" t="0"/>
+                            <a:stretch/>
+                          </pic:blipFill>
+                          <pic:spPr>
+                            <a:xfrm>
+                              <a:off x="3632850" y="152400"/>
+                              <a:ext cx="2826979" cy="7255204"/>
+                            </a:xfrm>
+                            <a:prstGeom prst="rect">
+                              <a:avLst/>
+                            </a:prstGeom>
                             <a:noFill/>
-                          </a:ln>
-                        </pic:spPr>
-                      </pic:pic>
+                            <a:ln>
+                              <a:noFill/>
+                            </a:ln>
+                          </pic:spPr>
+                        </pic:pic>
+                      </wpg:grpSp>
                     </wpg:wgp>
                   </a:graphicData>
                 </a:graphic>
@@ -1618,7 +1653,7 @@
               <wp:anchor allowOverlap="1" behindDoc="0" distB="0" distT="0" distL="114300" distR="114300" hidden="0" layoutInCell="1" locked="0" relativeHeight="0" simplePos="0">
                 <wp:simplePos x="0" y="0"/>
                 <wp:positionH relativeFrom="column">
-                  <wp:posOffset>57151</wp:posOffset>
+                  <wp:posOffset>57152</wp:posOffset>
                 </wp:positionH>
                 <wp:positionV relativeFrom="paragraph">
                   <wp:posOffset>123825</wp:posOffset>
@@ -1626,12 +1661,12 @@
                 <wp:extent cx="3209925" cy="8223615"/>
                 <wp:effectExtent b="0" l="0" r="0" t="0"/>
                 <wp:wrapNone/>
-                <wp:docPr id="2" name="image2.png"/>
+                <wp:docPr id="4" name="image6.png"/>
                 <a:graphic>
                   <a:graphicData uri="http://schemas.openxmlformats.org/drawingml/2006/picture">
                     <pic:pic>
                       <pic:nvPicPr>
-                        <pic:cNvPr id="0" name="image2.png"/>
+                        <pic:cNvPr id="0" name="image6.png"/>
                         <pic:cNvPicPr preferRelativeResize="0"/>
                       </pic:nvPicPr>
                       <pic:blipFill>
@@ -2249,6 +2284,7 @@
         </w:numPr>
         <w:tabs>
           <w:tab w:val="left" w:leader="none" w:pos="216"/>
+          <w:tab w:val="left" w:leader="none" w:pos="216"/>
         </w:tabs>
         <w:ind w:left="0" w:firstLine="216"/>
         <w:rPr/>
@@ -2308,7 +2344,7 @@
               <wp:anchor allowOverlap="1" behindDoc="0" distB="0" distT="0" distL="114300" distR="114300" hidden="0" layoutInCell="1" locked="0" relativeHeight="0" simplePos="0">
                 <wp:simplePos x="0" y="0"/>
                 <wp:positionH relativeFrom="column">
-                  <wp:posOffset>-9524</wp:posOffset>
+                  <wp:posOffset>-9523</wp:posOffset>
                 </wp:positionH>
                 <wp:positionV relativeFrom="paragraph">
                   <wp:posOffset>50800</wp:posOffset>
@@ -2323,79 +2359,121 @@
                       <wpg:cNvGrpSpPr/>
                       <wpg:grpSpPr>
                         <a:xfrm>
-                          <a:off x="1538625" y="1236625"/>
+                          <a:off x="3799425" y="2675275"/>
                           <a:ext cx="3089910" cy="2206183"/>
-                          <a:chOff x="1538625" y="1236625"/>
-                          <a:chExt cx="4682350" cy="3347350"/>
+                          <a:chOff x="3799425" y="2675275"/>
+                          <a:chExt cx="3093150" cy="2209450"/>
                         </a:xfrm>
                       </wpg:grpSpPr>
-                      <wps:wsp>
-                        <wps:cNvSpPr/>
-                        <wps:cNvPr id="2" name="Shape 2"/>
-                        <wps:spPr>
+                      <wpg:grpSp>
+                        <wpg:cNvGrpSpPr/>
+                        <wpg:grpSpPr>
                           <a:xfrm>
-                            <a:off x="1543400" y="1241400"/>
-                            <a:ext cx="4672800" cy="3337800"/>
+                            <a:off x="3801045" y="2676909"/>
+                            <a:ext cx="3089910" cy="2206183"/>
+                            <a:chOff x="1538625" y="1236625"/>
+                            <a:chExt cx="4682350" cy="3347350"/>
                           </a:xfrm>
-                          <a:prstGeom prst="rect">
-                            <a:avLst/>
-                          </a:prstGeom>
-                          <a:solidFill>
-                            <a:srgbClr val="FFFFFF"/>
-                          </a:solidFill>
-                          <a:ln cap="flat" cmpd="sng" w="9525">
+                        </wpg:grpSpPr>
+                        <wps:wsp>
+                          <wps:cNvSpPr/>
+                          <wps:cNvPr id="3" name="Shape 3"/>
+                          <wps:spPr>
+                            <a:xfrm>
+                              <a:off x="1538625" y="1236625"/>
+                              <a:ext cx="4682350" cy="3347350"/>
+                            </a:xfrm>
+                            <a:prstGeom prst="rect">
+                              <a:avLst/>
+                            </a:prstGeom>
+                            <a:noFill/>
+                            <a:ln>
+                              <a:noFill/>
+                            </a:ln>
+                          </wps:spPr>
+                          <wps:txbx>
+                            <w:txbxContent>
+                              <w:p>
+                                <w:pPr>
+                                  <w:spacing w:after="0" w:before="0" w:line="240"/>
+                                  <w:ind w:left="0" w:right="0" w:firstLine="0"/>
+                                  <w:jc w:val="left"/>
+                                  <w:textDirection w:val="btLr"/>
+                                </w:pPr>
+                              </w:p>
+                            </w:txbxContent>
+                          </wps:txbx>
+                          <wps:bodyPr anchorCtr="0" anchor="ctr" bIns="91425" lIns="91425" spcFirstLastPara="1" rIns="91425" wrap="square" tIns="91425">
+                            <a:noAutofit/>
+                          </wps:bodyPr>
+                        </wps:wsp>
+                        <wps:wsp>
+                          <wps:cNvSpPr/>
+                          <wps:cNvPr id="10" name="Shape 10"/>
+                          <wps:spPr>
+                            <a:xfrm>
+                              <a:off x="1543400" y="1241400"/>
+                              <a:ext cx="4672800" cy="3337800"/>
+                            </a:xfrm>
+                            <a:prstGeom prst="rect">
+                              <a:avLst/>
+                            </a:prstGeom>
                             <a:solidFill>
-                              <a:srgbClr val="000000"/>
+                              <a:srgbClr val="FFFFFF"/>
                             </a:solidFill>
-                            <a:prstDash val="solid"/>
-                            <a:miter lim="800000"/>
-                            <a:headEnd len="sm" w="sm" type="none"/>
-                            <a:tailEnd len="sm" w="sm" type="none"/>
-                          </a:ln>
-                        </wps:spPr>
-                        <wps:txbx>
-                          <w:txbxContent>
-                            <w:p>
-                              <w:pPr>
-                                <w:spacing w:after="120" w:before="0" w:line="227.99999713897705"/>
-                                <w:ind w:left="0" w:right="0" w:firstLine="287.99999237060547"/>
-                                <w:jc w:val="both"/>
-                                <w:textDirection w:val="btLr"/>
-                              </w:pPr>
-                            </w:p>
-                          </w:txbxContent>
-                        </wps:txbx>
-                        <wps:bodyPr anchorCtr="0" anchor="t" bIns="45700" lIns="91425" spcFirstLastPara="1" rIns="91425" wrap="square" tIns="45700">
-                          <a:noAutofit/>
-                        </wps:bodyPr>
-                      </wps:wsp>
-                      <pic:pic>
-                        <pic:nvPicPr>
-                          <pic:cNvPr id="5" name="Shape 5"/>
-                          <pic:cNvPicPr preferRelativeResize="0"/>
-                        </pic:nvPicPr>
-                        <pic:blipFill>
-                          <a:blip r:embed="rId11">
-                            <a:alphaModFix/>
-                          </a:blip>
-                          <a:stretch>
-                            <a:fillRect/>
-                          </a:stretch>
-                        </pic:blipFill>
-                        <pic:spPr>
-                          <a:xfrm>
-                            <a:off x="1543400" y="1241400"/>
-                            <a:ext cx="4672802" cy="3337715"/>
-                          </a:xfrm>
-                          <a:prstGeom prst="rect">
-                            <a:avLst/>
-                          </a:prstGeom>
-                          <a:noFill/>
-                          <a:ln>
+                            <a:ln cap="flat" cmpd="sng" w="9525">
+                              <a:solidFill>
+                                <a:srgbClr val="000000"/>
+                              </a:solidFill>
+                              <a:prstDash val="solid"/>
+                              <a:miter lim="800000"/>
+                              <a:headEnd len="sm" w="sm" type="none"/>
+                              <a:tailEnd len="sm" w="sm" type="none"/>
+                            </a:ln>
+                          </wps:spPr>
+                          <wps:txbx>
+                            <w:txbxContent>
+                              <w:p>
+                                <w:pPr>
+                                  <w:spacing w:after="120" w:before="0" w:line="227.99999713897705"/>
+                                  <w:ind w:left="0" w:right="0" w:firstLine="287.99999237060547"/>
+                                  <w:jc w:val="both"/>
+                                  <w:textDirection w:val="btLr"/>
+                                </w:pPr>
+                              </w:p>
+                            </w:txbxContent>
+                          </wps:txbx>
+                          <wps:bodyPr anchorCtr="0" anchor="t" bIns="45700" lIns="91425" spcFirstLastPara="1" rIns="91425" wrap="square" tIns="45700">
+                            <a:noAutofit/>
+                          </wps:bodyPr>
+                        </wps:wsp>
+                        <pic:pic>
+                          <pic:nvPicPr>
+                            <pic:cNvPr id="11" name="Shape 11"/>
+                            <pic:cNvPicPr preferRelativeResize="0"/>
+                          </pic:nvPicPr>
+                          <pic:blipFill rotWithShape="1">
+                            <a:blip r:embed="rId11">
+                              <a:alphaModFix/>
+                            </a:blip>
+                            <a:srcRect b="0" l="0" r="0" t="0"/>
+                            <a:stretch/>
+                          </pic:blipFill>
+                          <pic:spPr>
+                            <a:xfrm>
+                              <a:off x="1543400" y="1241400"/>
+                              <a:ext cx="4672802" cy="3337715"/>
+                            </a:xfrm>
+                            <a:prstGeom prst="rect">
+                              <a:avLst/>
+                            </a:prstGeom>
                             <a:noFill/>
-                          </a:ln>
-                        </pic:spPr>
-                      </pic:pic>
+                            <a:ln>
+                              <a:noFill/>
+                            </a:ln>
+                          </pic:spPr>
+                        </pic:pic>
+                      </wpg:grpSp>
                     </wpg:wgp>
                   </a:graphicData>
                 </a:graphic>
@@ -2407,7 +2485,7 @@
               <wp:anchor allowOverlap="1" behindDoc="0" distB="0" distT="0" distL="114300" distR="114300" hidden="0" layoutInCell="1" locked="0" relativeHeight="0" simplePos="0">
                 <wp:simplePos x="0" y="0"/>
                 <wp:positionH relativeFrom="column">
-                  <wp:posOffset>-9524</wp:posOffset>
+                  <wp:posOffset>-9523</wp:posOffset>
                 </wp:positionH>
                 <wp:positionV relativeFrom="paragraph">
                   <wp:posOffset>50800</wp:posOffset>
@@ -2415,12 +2493,12 @@
                 <wp:extent cx="3089910" cy="2206183"/>
                 <wp:effectExtent b="0" l="0" r="0" t="0"/>
                 <wp:wrapSquare wrapText="bothSides" distB="0" distT="0" distL="114300" distR="114300"/>
-                <wp:docPr id="3" name="image3.png"/>
+                <wp:docPr id="3" name="image5.png"/>
                 <a:graphic>
                   <a:graphicData uri="http://schemas.openxmlformats.org/drawingml/2006/picture">
                     <pic:pic>
                       <pic:nvPicPr>
-                        <pic:cNvPr id="0" name="image3.png"/>
+                        <pic:cNvPr id="0" name="image5.png"/>
                         <pic:cNvPicPr preferRelativeResize="0"/>
                       </pic:nvPicPr>
                       <pic:blipFill>
@@ -2529,10 +2607,10 @@
         <w:tc>
           <w:tcPr>
             <w:tcMar>
-              <w:top w:w="14.399999999999999" w:type="dxa"/>
-              <w:left w:w="14.399999999999999" w:type="dxa"/>
-              <w:bottom w:w="14.399999999999999" w:type="dxa"/>
-              <w:right w:w="14.399999999999999" w:type="dxa"/>
+              <w:top w:w="0.0" w:type="dxa"/>
+              <w:left w:w="0.0" w:type="dxa"/>
+              <w:bottom w:w="0.0" w:type="dxa"/>
+              <w:right w:w="0.0" w:type="dxa"/>
             </w:tcMar>
             <w:vAlign w:val="center"/>
           </w:tcPr>
@@ -2567,10 +2645,10 @@
         <w:tc>
           <w:tcPr>
             <w:tcMar>
-              <w:top w:w="14.399999999999999" w:type="dxa"/>
-              <w:left w:w="14.399999999999999" w:type="dxa"/>
-              <w:bottom w:w="14.399999999999999" w:type="dxa"/>
-              <w:right w:w="14.399999999999999" w:type="dxa"/>
+              <w:top w:w="0.0" w:type="dxa"/>
+              <w:left w:w="0.0" w:type="dxa"/>
+              <w:bottom w:w="0.0" w:type="dxa"/>
+              <w:right w:w="0.0" w:type="dxa"/>
             </w:tcMar>
             <w:vAlign w:val="center"/>
           </w:tcPr>
@@ -2605,10 +2683,10 @@
         <w:tc>
           <w:tcPr>
             <w:tcMar>
-              <w:top w:w="14.399999999999999" w:type="dxa"/>
-              <w:left w:w="14.399999999999999" w:type="dxa"/>
-              <w:bottom w:w="14.399999999999999" w:type="dxa"/>
-              <w:right w:w="14.399999999999999" w:type="dxa"/>
+              <w:top w:w="0.0" w:type="dxa"/>
+              <w:left w:w="0.0" w:type="dxa"/>
+              <w:bottom w:w="0.0" w:type="dxa"/>
+              <w:right w:w="0.0" w:type="dxa"/>
             </w:tcMar>
             <w:vAlign w:val="center"/>
           </w:tcPr>
@@ -2643,10 +2721,10 @@
         <w:tc>
           <w:tcPr>
             <w:tcMar>
-              <w:top w:w="14.399999999999999" w:type="dxa"/>
-              <w:left w:w="14.399999999999999" w:type="dxa"/>
-              <w:bottom w:w="14.399999999999999" w:type="dxa"/>
-              <w:right w:w="14.399999999999999" w:type="dxa"/>
+              <w:top w:w="0.0" w:type="dxa"/>
+              <w:left w:w="0.0" w:type="dxa"/>
+              <w:bottom w:w="0.0" w:type="dxa"/>
+              <w:right w:w="0.0" w:type="dxa"/>
             </w:tcMar>
             <w:vAlign w:val="center"/>
           </w:tcPr>
@@ -2681,10 +2759,10 @@
         <w:tc>
           <w:tcPr>
             <w:tcMar>
-              <w:top w:w="14.399999999999999" w:type="dxa"/>
-              <w:left w:w="14.399999999999999" w:type="dxa"/>
-              <w:bottom w:w="14.399999999999999" w:type="dxa"/>
-              <w:right w:w="14.399999999999999" w:type="dxa"/>
+              <w:top w:w="0.0" w:type="dxa"/>
+              <w:left w:w="0.0" w:type="dxa"/>
+              <w:bottom w:w="0.0" w:type="dxa"/>
+              <w:right w:w="0.0" w:type="dxa"/>
             </w:tcMar>
             <w:vAlign w:val="center"/>
           </w:tcPr>
@@ -2725,10 +2803,10 @@
         <w:tc>
           <w:tcPr>
             <w:tcMar>
-              <w:top w:w="14.399999999999999" w:type="dxa"/>
-              <w:left w:w="14.399999999999999" w:type="dxa"/>
-              <w:bottom w:w="14.399999999999999" w:type="dxa"/>
-              <w:right w:w="14.399999999999999" w:type="dxa"/>
+              <w:top w:w="0.0" w:type="dxa"/>
+              <w:left w:w="0.0" w:type="dxa"/>
+              <w:bottom w:w="0.0" w:type="dxa"/>
+              <w:right w:w="0.0" w:type="dxa"/>
             </w:tcMar>
             <w:vAlign w:val="center"/>
           </w:tcPr>
@@ -2763,10 +2841,10 @@
         <w:tc>
           <w:tcPr>
             <w:tcMar>
-              <w:top w:w="14.399999999999999" w:type="dxa"/>
-              <w:left w:w="14.399999999999999" w:type="dxa"/>
-              <w:bottom w:w="14.399999999999999" w:type="dxa"/>
-              <w:right w:w="14.399999999999999" w:type="dxa"/>
+              <w:top w:w="0.0" w:type="dxa"/>
+              <w:left w:w="0.0" w:type="dxa"/>
+              <w:bottom w:w="0.0" w:type="dxa"/>
+              <w:right w:w="0.0" w:type="dxa"/>
             </w:tcMar>
             <w:vAlign w:val="center"/>
           </w:tcPr>
@@ -2794,10 +2872,10 @@
         <w:tc>
           <w:tcPr>
             <w:tcMar>
-              <w:top w:w="14.399999999999999" w:type="dxa"/>
-              <w:left w:w="14.399999999999999" w:type="dxa"/>
-              <w:bottom w:w="14.399999999999999" w:type="dxa"/>
-              <w:right w:w="14.399999999999999" w:type="dxa"/>
+              <w:top w:w="0.0" w:type="dxa"/>
+              <w:left w:w="0.0" w:type="dxa"/>
+              <w:bottom w:w="0.0" w:type="dxa"/>
+              <w:right w:w="0.0" w:type="dxa"/>
             </w:tcMar>
             <w:vAlign w:val="center"/>
           </w:tcPr>
@@ -2825,10 +2903,10 @@
         <w:tc>
           <w:tcPr>
             <w:tcMar>
-              <w:top w:w="14.399999999999999" w:type="dxa"/>
-              <w:left w:w="14.399999999999999" w:type="dxa"/>
-              <w:bottom w:w="14.399999999999999" w:type="dxa"/>
-              <w:right w:w="14.399999999999999" w:type="dxa"/>
+              <w:top w:w="0.0" w:type="dxa"/>
+              <w:left w:w="0.0" w:type="dxa"/>
+              <w:bottom w:w="0.0" w:type="dxa"/>
+              <w:right w:w="0.0" w:type="dxa"/>
             </w:tcMar>
             <w:vAlign w:val="center"/>
           </w:tcPr>
@@ -2856,10 +2934,10 @@
         <w:tc>
           <w:tcPr>
             <w:tcMar>
-              <w:top w:w="14.399999999999999" w:type="dxa"/>
-              <w:left w:w="14.399999999999999" w:type="dxa"/>
-              <w:bottom w:w="14.399999999999999" w:type="dxa"/>
-              <w:right w:w="14.399999999999999" w:type="dxa"/>
+              <w:top w:w="0.0" w:type="dxa"/>
+              <w:left w:w="0.0" w:type="dxa"/>
+              <w:bottom w:w="0.0" w:type="dxa"/>
+              <w:right w:w="0.0" w:type="dxa"/>
             </w:tcMar>
             <w:vAlign w:val="center"/>
           </w:tcPr>
@@ -2893,10 +2971,10 @@
         <w:tc>
           <w:tcPr>
             <w:tcMar>
-              <w:top w:w="14.399999999999999" w:type="dxa"/>
-              <w:left w:w="14.399999999999999" w:type="dxa"/>
-              <w:bottom w:w="14.399999999999999" w:type="dxa"/>
-              <w:right w:w="14.399999999999999" w:type="dxa"/>
+              <w:top w:w="0.0" w:type="dxa"/>
+              <w:left w:w="0.0" w:type="dxa"/>
+              <w:bottom w:w="0.0" w:type="dxa"/>
+              <w:right w:w="0.0" w:type="dxa"/>
             </w:tcMar>
             <w:vAlign w:val="center"/>
           </w:tcPr>
@@ -2931,10 +3009,10 @@
         <w:tc>
           <w:tcPr>
             <w:tcMar>
-              <w:top w:w="14.399999999999999" w:type="dxa"/>
-              <w:left w:w="14.399999999999999" w:type="dxa"/>
-              <w:bottom w:w="14.399999999999999" w:type="dxa"/>
-              <w:right w:w="14.399999999999999" w:type="dxa"/>
+              <w:top w:w="0.0" w:type="dxa"/>
+              <w:left w:w="0.0" w:type="dxa"/>
+              <w:bottom w:w="0.0" w:type="dxa"/>
+              <w:right w:w="0.0" w:type="dxa"/>
             </w:tcMar>
             <w:vAlign w:val="center"/>
           </w:tcPr>
@@ -2962,10 +3040,10 @@
         <w:tc>
           <w:tcPr>
             <w:tcMar>
-              <w:top w:w="14.399999999999999" w:type="dxa"/>
-              <w:left w:w="14.399999999999999" w:type="dxa"/>
-              <w:bottom w:w="14.399999999999999" w:type="dxa"/>
-              <w:right w:w="14.399999999999999" w:type="dxa"/>
+              <w:top w:w="0.0" w:type="dxa"/>
+              <w:left w:w="0.0" w:type="dxa"/>
+              <w:bottom w:w="0.0" w:type="dxa"/>
+              <w:right w:w="0.0" w:type="dxa"/>
             </w:tcMar>
             <w:vAlign w:val="center"/>
           </w:tcPr>
@@ -2993,10 +3071,10 @@
         <w:tc>
           <w:tcPr>
             <w:tcMar>
-              <w:top w:w="14.399999999999999" w:type="dxa"/>
-              <w:left w:w="14.399999999999999" w:type="dxa"/>
-              <w:bottom w:w="14.399999999999999" w:type="dxa"/>
-              <w:right w:w="14.399999999999999" w:type="dxa"/>
+              <w:top w:w="0.0" w:type="dxa"/>
+              <w:left w:w="0.0" w:type="dxa"/>
+              <w:bottom w:w="0.0" w:type="dxa"/>
+              <w:right w:w="0.0" w:type="dxa"/>
             </w:tcMar>
             <w:vAlign w:val="center"/>
           </w:tcPr>
@@ -3024,10 +3102,10 @@
         <w:tc>
           <w:tcPr>
             <w:tcMar>
-              <w:top w:w="14.399999999999999" w:type="dxa"/>
-              <w:left w:w="14.399999999999999" w:type="dxa"/>
-              <w:bottom w:w="14.399999999999999" w:type="dxa"/>
-              <w:right w:w="14.399999999999999" w:type="dxa"/>
+              <w:top w:w="0.0" w:type="dxa"/>
+              <w:left w:w="0.0" w:type="dxa"/>
+              <w:bottom w:w="0.0" w:type="dxa"/>
+              <w:right w:w="0.0" w:type="dxa"/>
             </w:tcMar>
             <w:vAlign w:val="center"/>
           </w:tcPr>
@@ -3061,10 +3139,10 @@
         <w:tc>
           <w:tcPr>
             <w:tcMar>
-              <w:top w:w="14.399999999999999" w:type="dxa"/>
-              <w:left w:w="14.399999999999999" w:type="dxa"/>
-              <w:bottom w:w="14.399999999999999" w:type="dxa"/>
-              <w:right w:w="14.399999999999999" w:type="dxa"/>
+              <w:top w:w="0.0" w:type="dxa"/>
+              <w:left w:w="0.0" w:type="dxa"/>
+              <w:bottom w:w="0.0" w:type="dxa"/>
+              <w:right w:w="0.0" w:type="dxa"/>
             </w:tcMar>
             <w:vAlign w:val="center"/>
           </w:tcPr>
@@ -3099,10 +3177,10 @@
         <w:tc>
           <w:tcPr>
             <w:tcMar>
-              <w:top w:w="14.399999999999999" w:type="dxa"/>
-              <w:left w:w="14.399999999999999" w:type="dxa"/>
-              <w:bottom w:w="14.399999999999999" w:type="dxa"/>
-              <w:right w:w="14.399999999999999" w:type="dxa"/>
+              <w:top w:w="0.0" w:type="dxa"/>
+              <w:left w:w="0.0" w:type="dxa"/>
+              <w:bottom w:w="0.0" w:type="dxa"/>
+              <w:right w:w="0.0" w:type="dxa"/>
             </w:tcMar>
             <w:vAlign w:val="center"/>
           </w:tcPr>
@@ -3130,10 +3208,10 @@
         <w:tc>
           <w:tcPr>
             <w:tcMar>
-              <w:top w:w="14.399999999999999" w:type="dxa"/>
-              <w:left w:w="14.399999999999999" w:type="dxa"/>
-              <w:bottom w:w="14.399999999999999" w:type="dxa"/>
-              <w:right w:w="14.399999999999999" w:type="dxa"/>
+              <w:top w:w="0.0" w:type="dxa"/>
+              <w:left w:w="0.0" w:type="dxa"/>
+              <w:bottom w:w="0.0" w:type="dxa"/>
+              <w:right w:w="0.0" w:type="dxa"/>
             </w:tcMar>
             <w:vAlign w:val="center"/>
           </w:tcPr>
@@ -3161,10 +3239,10 @@
         <w:tc>
           <w:tcPr>
             <w:tcMar>
-              <w:top w:w="14.399999999999999" w:type="dxa"/>
-              <w:left w:w="14.399999999999999" w:type="dxa"/>
-              <w:bottom w:w="14.399999999999999" w:type="dxa"/>
-              <w:right w:w="14.399999999999999" w:type="dxa"/>
+              <w:top w:w="0.0" w:type="dxa"/>
+              <w:left w:w="0.0" w:type="dxa"/>
+              <w:bottom w:w="0.0" w:type="dxa"/>
+              <w:right w:w="0.0" w:type="dxa"/>
             </w:tcMar>
             <w:vAlign w:val="center"/>
           </w:tcPr>
@@ -3192,10 +3270,10 @@
         <w:tc>
           <w:tcPr>
             <w:tcMar>
-              <w:top w:w="14.399999999999999" w:type="dxa"/>
-              <w:left w:w="14.399999999999999" w:type="dxa"/>
-              <w:bottom w:w="14.399999999999999" w:type="dxa"/>
-              <w:right w:w="14.399999999999999" w:type="dxa"/>
+              <w:top w:w="0.0" w:type="dxa"/>
+              <w:left w:w="0.0" w:type="dxa"/>
+              <w:bottom w:w="0.0" w:type="dxa"/>
+              <w:right w:w="0.0" w:type="dxa"/>
             </w:tcMar>
             <w:vAlign w:val="center"/>
           </w:tcPr>
@@ -3229,10 +3307,10 @@
         <w:tc>
           <w:tcPr>
             <w:tcMar>
-              <w:top w:w="14.399999999999999" w:type="dxa"/>
-              <w:left w:w="14.399999999999999" w:type="dxa"/>
-              <w:bottom w:w="14.399999999999999" w:type="dxa"/>
-              <w:right w:w="14.399999999999999" w:type="dxa"/>
+              <w:top w:w="0.0" w:type="dxa"/>
+              <w:left w:w="0.0" w:type="dxa"/>
+              <w:bottom w:w="0.0" w:type="dxa"/>
+              <w:right w:w="0.0" w:type="dxa"/>
             </w:tcMar>
             <w:vAlign w:val="center"/>
           </w:tcPr>
@@ -3267,10 +3345,10 @@
         <w:tc>
           <w:tcPr>
             <w:tcMar>
-              <w:top w:w="14.399999999999999" w:type="dxa"/>
-              <w:left w:w="14.399999999999999" w:type="dxa"/>
-              <w:bottom w:w="14.399999999999999" w:type="dxa"/>
-              <w:right w:w="14.399999999999999" w:type="dxa"/>
+              <w:top w:w="0.0" w:type="dxa"/>
+              <w:left w:w="0.0" w:type="dxa"/>
+              <w:bottom w:w="0.0" w:type="dxa"/>
+              <w:right w:w="0.0" w:type="dxa"/>
             </w:tcMar>
             <w:vAlign w:val="center"/>
           </w:tcPr>
@@ -3298,10 +3376,10 @@
         <w:tc>
           <w:tcPr>
             <w:tcMar>
-              <w:top w:w="14.399999999999999" w:type="dxa"/>
-              <w:left w:w="14.399999999999999" w:type="dxa"/>
-              <w:bottom w:w="14.399999999999999" w:type="dxa"/>
-              <w:right w:w="14.399999999999999" w:type="dxa"/>
+              <w:top w:w="0.0" w:type="dxa"/>
+              <w:left w:w="0.0" w:type="dxa"/>
+              <w:bottom w:w="0.0" w:type="dxa"/>
+              <w:right w:w="0.0" w:type="dxa"/>
             </w:tcMar>
             <w:vAlign w:val="center"/>
           </w:tcPr>
@@ -3329,10 +3407,10 @@
         <w:tc>
           <w:tcPr>
             <w:tcMar>
-              <w:top w:w="14.399999999999999" w:type="dxa"/>
-              <w:left w:w="14.399999999999999" w:type="dxa"/>
-              <w:bottom w:w="14.399999999999999" w:type="dxa"/>
-              <w:right w:w="14.399999999999999" w:type="dxa"/>
+              <w:top w:w="0.0" w:type="dxa"/>
+              <w:left w:w="0.0" w:type="dxa"/>
+              <w:bottom w:w="0.0" w:type="dxa"/>
+              <w:right w:w="0.0" w:type="dxa"/>
             </w:tcMar>
             <w:vAlign w:val="center"/>
           </w:tcPr>
@@ -3360,10 +3438,10 @@
         <w:tc>
           <w:tcPr>
             <w:tcMar>
-              <w:top w:w="14.399999999999999" w:type="dxa"/>
-              <w:left w:w="14.399999999999999" w:type="dxa"/>
-              <w:bottom w:w="14.399999999999999" w:type="dxa"/>
-              <w:right w:w="14.399999999999999" w:type="dxa"/>
+              <w:top w:w="0.0" w:type="dxa"/>
+              <w:left w:w="0.0" w:type="dxa"/>
+              <w:bottom w:w="0.0" w:type="dxa"/>
+              <w:right w:w="0.0" w:type="dxa"/>
             </w:tcMar>
             <w:vAlign w:val="center"/>
           </w:tcPr>
@@ -3397,10 +3475,10 @@
         <w:tc>
           <w:tcPr>
             <w:tcMar>
-              <w:top w:w="14.399999999999999" w:type="dxa"/>
-              <w:left w:w="14.399999999999999" w:type="dxa"/>
-              <w:bottom w:w="14.399999999999999" w:type="dxa"/>
-              <w:right w:w="14.399999999999999" w:type="dxa"/>
+              <w:top w:w="0.0" w:type="dxa"/>
+              <w:left w:w="0.0" w:type="dxa"/>
+              <w:bottom w:w="0.0" w:type="dxa"/>
+              <w:right w:w="0.0" w:type="dxa"/>
             </w:tcMar>
             <w:vAlign w:val="center"/>
           </w:tcPr>
@@ -3435,10 +3513,10 @@
         <w:tc>
           <w:tcPr>
             <w:tcMar>
-              <w:top w:w="14.399999999999999" w:type="dxa"/>
-              <w:left w:w="14.399999999999999" w:type="dxa"/>
-              <w:bottom w:w="14.399999999999999" w:type="dxa"/>
-              <w:right w:w="14.399999999999999" w:type="dxa"/>
+              <w:top w:w="0.0" w:type="dxa"/>
+              <w:left w:w="0.0" w:type="dxa"/>
+              <w:bottom w:w="0.0" w:type="dxa"/>
+              <w:right w:w="0.0" w:type="dxa"/>
             </w:tcMar>
             <w:vAlign w:val="center"/>
           </w:tcPr>
@@ -3466,10 +3544,10 @@
         <w:tc>
           <w:tcPr>
             <w:tcMar>
-              <w:top w:w="14.399999999999999" w:type="dxa"/>
-              <w:left w:w="14.399999999999999" w:type="dxa"/>
-              <w:bottom w:w="14.399999999999999" w:type="dxa"/>
-              <w:right w:w="14.399999999999999" w:type="dxa"/>
+              <w:top w:w="0.0" w:type="dxa"/>
+              <w:left w:w="0.0" w:type="dxa"/>
+              <w:bottom w:w="0.0" w:type="dxa"/>
+              <w:right w:w="0.0" w:type="dxa"/>
             </w:tcMar>
             <w:vAlign w:val="center"/>
           </w:tcPr>
@@ -3497,10 +3575,10 @@
         <w:tc>
           <w:tcPr>
             <w:tcMar>
-              <w:top w:w="14.399999999999999" w:type="dxa"/>
-              <w:left w:w="14.399999999999999" w:type="dxa"/>
-              <w:bottom w:w="14.399999999999999" w:type="dxa"/>
-              <w:right w:w="14.399999999999999" w:type="dxa"/>
+              <w:top w:w="0.0" w:type="dxa"/>
+              <w:left w:w="0.0" w:type="dxa"/>
+              <w:bottom w:w="0.0" w:type="dxa"/>
+              <w:right w:w="0.0" w:type="dxa"/>
             </w:tcMar>
             <w:vAlign w:val="center"/>
           </w:tcPr>
@@ -3528,10 +3606,10 @@
         <w:tc>
           <w:tcPr>
             <w:tcMar>
-              <w:top w:w="14.399999999999999" w:type="dxa"/>
-              <w:left w:w="14.399999999999999" w:type="dxa"/>
-              <w:bottom w:w="14.399999999999999" w:type="dxa"/>
-              <w:right w:w="14.399999999999999" w:type="dxa"/>
+              <w:top w:w="0.0" w:type="dxa"/>
+              <w:left w:w="0.0" w:type="dxa"/>
+              <w:bottom w:w="0.0" w:type="dxa"/>
+              <w:right w:w="0.0" w:type="dxa"/>
             </w:tcMar>
             <w:vAlign w:val="center"/>
           </w:tcPr>
@@ -3565,10 +3643,10 @@
         <w:tc>
           <w:tcPr>
             <w:tcMar>
-              <w:top w:w="14.399999999999999" w:type="dxa"/>
-              <w:left w:w="14.399999999999999" w:type="dxa"/>
-              <w:bottom w:w="14.399999999999999" w:type="dxa"/>
-              <w:right w:w="14.399999999999999" w:type="dxa"/>
+              <w:top w:w="0.0" w:type="dxa"/>
+              <w:left w:w="0.0" w:type="dxa"/>
+              <w:bottom w:w="0.0" w:type="dxa"/>
+              <w:right w:w="0.0" w:type="dxa"/>
             </w:tcMar>
             <w:vAlign w:val="center"/>
           </w:tcPr>
@@ -3603,10 +3681,10 @@
         <w:tc>
           <w:tcPr>
             <w:tcMar>
-              <w:top w:w="14.399999999999999" w:type="dxa"/>
-              <w:left w:w="14.399999999999999" w:type="dxa"/>
-              <w:bottom w:w="14.399999999999999" w:type="dxa"/>
-              <w:right w:w="14.399999999999999" w:type="dxa"/>
+              <w:top w:w="0.0" w:type="dxa"/>
+              <w:left w:w="0.0" w:type="dxa"/>
+              <w:bottom w:w="0.0" w:type="dxa"/>
+              <w:right w:w="0.0" w:type="dxa"/>
             </w:tcMar>
             <w:vAlign w:val="center"/>
           </w:tcPr>
@@ -3634,10 +3712,10 @@
         <w:tc>
           <w:tcPr>
             <w:tcMar>
-              <w:top w:w="14.399999999999999" w:type="dxa"/>
-              <w:left w:w="14.399999999999999" w:type="dxa"/>
-              <w:bottom w:w="14.399999999999999" w:type="dxa"/>
-              <w:right w:w="14.399999999999999" w:type="dxa"/>
+              <w:top w:w="0.0" w:type="dxa"/>
+              <w:left w:w="0.0" w:type="dxa"/>
+              <w:bottom w:w="0.0" w:type="dxa"/>
+              <w:right w:w="0.0" w:type="dxa"/>
             </w:tcMar>
             <w:vAlign w:val="center"/>
           </w:tcPr>
@@ -3665,10 +3743,10 @@
         <w:tc>
           <w:tcPr>
             <w:tcMar>
-              <w:top w:w="14.399999999999999" w:type="dxa"/>
-              <w:left w:w="14.399999999999999" w:type="dxa"/>
-              <w:bottom w:w="14.399999999999999" w:type="dxa"/>
-              <w:right w:w="14.399999999999999" w:type="dxa"/>
+              <w:top w:w="0.0" w:type="dxa"/>
+              <w:left w:w="0.0" w:type="dxa"/>
+              <w:bottom w:w="0.0" w:type="dxa"/>
+              <w:right w:w="0.0" w:type="dxa"/>
             </w:tcMar>
             <w:vAlign w:val="center"/>
           </w:tcPr>
@@ -3696,10 +3774,10 @@
         <w:tc>
           <w:tcPr>
             <w:tcMar>
-              <w:top w:w="14.399999999999999" w:type="dxa"/>
-              <w:left w:w="14.399999999999999" w:type="dxa"/>
-              <w:bottom w:w="14.399999999999999" w:type="dxa"/>
-              <w:right w:w="14.399999999999999" w:type="dxa"/>
+              <w:top w:w="0.0" w:type="dxa"/>
+              <w:left w:w="0.0" w:type="dxa"/>
+              <w:bottom w:w="0.0" w:type="dxa"/>
+              <w:right w:w="0.0" w:type="dxa"/>
             </w:tcMar>
             <w:vAlign w:val="center"/>
           </w:tcPr>
@@ -3733,10 +3811,10 @@
         <w:tc>
           <w:tcPr>
             <w:tcMar>
-              <w:top w:w="14.399999999999999" w:type="dxa"/>
-              <w:left w:w="14.399999999999999" w:type="dxa"/>
-              <w:bottom w:w="14.399999999999999" w:type="dxa"/>
-              <w:right w:w="14.399999999999999" w:type="dxa"/>
+              <w:top w:w="0.0" w:type="dxa"/>
+              <w:left w:w="0.0" w:type="dxa"/>
+              <w:bottom w:w="0.0" w:type="dxa"/>
+              <w:right w:w="0.0" w:type="dxa"/>
             </w:tcMar>
             <w:vAlign w:val="center"/>
           </w:tcPr>
@@ -3771,10 +3849,10 @@
         <w:tc>
           <w:tcPr>
             <w:tcMar>
-              <w:top w:w="14.399999999999999" w:type="dxa"/>
-              <w:left w:w="14.399999999999999" w:type="dxa"/>
-              <w:bottom w:w="14.399999999999999" w:type="dxa"/>
-              <w:right w:w="14.399999999999999" w:type="dxa"/>
+              <w:top w:w="0.0" w:type="dxa"/>
+              <w:left w:w="0.0" w:type="dxa"/>
+              <w:bottom w:w="0.0" w:type="dxa"/>
+              <w:right w:w="0.0" w:type="dxa"/>
             </w:tcMar>
             <w:vAlign w:val="center"/>
           </w:tcPr>
@@ -3802,10 +3880,10 @@
         <w:tc>
           <w:tcPr>
             <w:tcMar>
-              <w:top w:w="14.399999999999999" w:type="dxa"/>
-              <w:left w:w="14.399999999999999" w:type="dxa"/>
-              <w:bottom w:w="14.399999999999999" w:type="dxa"/>
-              <w:right w:w="14.399999999999999" w:type="dxa"/>
+              <w:top w:w="0.0" w:type="dxa"/>
+              <w:left w:w="0.0" w:type="dxa"/>
+              <w:bottom w:w="0.0" w:type="dxa"/>
+              <w:right w:w="0.0" w:type="dxa"/>
             </w:tcMar>
             <w:vAlign w:val="center"/>
           </w:tcPr>
@@ -3833,10 +3911,10 @@
         <w:tc>
           <w:tcPr>
             <w:tcMar>
-              <w:top w:w="14.399999999999999" w:type="dxa"/>
-              <w:left w:w="14.399999999999999" w:type="dxa"/>
-              <w:bottom w:w="14.399999999999999" w:type="dxa"/>
-              <w:right w:w="14.399999999999999" w:type="dxa"/>
+              <w:top w:w="0.0" w:type="dxa"/>
+              <w:left w:w="0.0" w:type="dxa"/>
+              <w:bottom w:w="0.0" w:type="dxa"/>
+              <w:right w:w="0.0" w:type="dxa"/>
             </w:tcMar>
             <w:vAlign w:val="center"/>
           </w:tcPr>
@@ -3864,10 +3942,10 @@
         <w:tc>
           <w:tcPr>
             <w:tcMar>
-              <w:top w:w="14.399999999999999" w:type="dxa"/>
-              <w:left w:w="14.399999999999999" w:type="dxa"/>
-              <w:bottom w:w="14.399999999999999" w:type="dxa"/>
-              <w:right w:w="14.399999999999999" w:type="dxa"/>
+              <w:top w:w="0.0" w:type="dxa"/>
+              <w:left w:w="0.0" w:type="dxa"/>
+              <w:bottom w:w="0.0" w:type="dxa"/>
+              <w:right w:w="0.0" w:type="dxa"/>
             </w:tcMar>
             <w:vAlign w:val="center"/>
           </w:tcPr>
@@ -3889,6 +3967,175 @@
                 <w:rtl w:val="0"/>
               </w:rPr>
               <w:t xml:space="preserve">1–3 seconds</w:t>
+            </w:r>
+          </w:p>
+        </w:tc>
+      </w:tr>
+      <w:tr>
+        <w:trPr>
+          <w:cantSplit w:val="0"/>
+          <w:trHeight w:val="1469.4677734375" w:hRule="atLeast"/>
+          <w:tblHeader w:val="0"/>
+        </w:trPr>
+        <w:tc>
+          <w:tcPr>
+            <w:tcMar>
+              <w:top w:w="0.0" w:type="dxa"/>
+              <w:left w:w="0.0" w:type="dxa"/>
+              <w:bottom w:w="0.0" w:type="dxa"/>
+              <w:right w:w="0.0" w:type="dxa"/>
+            </w:tcMar>
+            <w:vAlign w:val="center"/>
+          </w:tcPr>
+          <w:p>
+            <w:pPr>
+              <w:tabs>
+                <w:tab w:val="left" w:leader="none" w:pos="533"/>
+              </w:tabs>
+              <w:spacing w:after="200" w:before="80" w:lineRule="auto"/>
+              <w:rPr>
+                <w:sz w:val="16"/>
+                <w:szCs w:val="16"/>
+              </w:rPr>
+            </w:pPr>
+            <w:r>
+              <w:rPr>
+                <w:b w:val="1"/>
+                <w:bCs w:val="1"/>
+                <w:sz w:val="16"/>
+                <w:szCs w:val="16"/>
+                <w:rtl w:val="0"/>
+              </w:rPr>
+              <w:t xml:space="preserve">Cloud Dependency</w:t>
+            </w:r>
+            <w:r>
+              <w:rPr>
+                <w:rtl w:val="0"/>
+              </w:rPr>
+            </w:r>
+          </w:p>
+        </w:tc>
+        <w:tc>
+          <w:tcPr>
+            <w:tcMar>
+              <w:top w:w="0.0" w:type="dxa"/>
+              <w:left w:w="0.0" w:type="dxa"/>
+              <w:bottom w:w="0.0" w:type="dxa"/>
+              <w:right w:w="0.0" w:type="dxa"/>
+            </w:tcMar>
+            <w:vAlign w:val="center"/>
+          </w:tcPr>
+          <w:p>
+            <w:pPr>
+              <w:tabs>
+                <w:tab w:val="left" w:leader="none" w:pos="533"/>
+              </w:tabs>
+              <w:spacing w:after="200" w:before="80" w:lineRule="auto"/>
+              <w:rPr>
+                <w:sz w:val="16"/>
+                <w:szCs w:val="16"/>
+              </w:rPr>
+            </w:pPr>
+            <w:r>
+              <w:rPr>
+                <w:sz w:val="16"/>
+                <w:szCs w:val="16"/>
+                <w:rtl w:val="0"/>
+              </w:rPr>
+              <w:t xml:space="preserve">None</w:t>
+            </w:r>
+          </w:p>
+        </w:tc>
+        <w:tc>
+          <w:tcPr>
+            <w:tcMar>
+              <w:top w:w="0.0" w:type="dxa"/>
+              <w:left w:w="0.0" w:type="dxa"/>
+              <w:bottom w:w="0.0" w:type="dxa"/>
+              <w:right w:w="0.0" w:type="dxa"/>
+            </w:tcMar>
+            <w:vAlign w:val="center"/>
+          </w:tcPr>
+          <w:p>
+            <w:pPr>
+              <w:tabs>
+                <w:tab w:val="left" w:leader="none" w:pos="533"/>
+              </w:tabs>
+              <w:spacing w:after="200" w:before="80" w:lineRule="auto"/>
+              <w:rPr>
+                <w:sz w:val="16"/>
+                <w:szCs w:val="16"/>
+              </w:rPr>
+            </w:pPr>
+            <w:r>
+              <w:rPr>
+                <w:sz w:val="16"/>
+                <w:szCs w:val="16"/>
+                <w:rtl w:val="0"/>
+              </w:rPr>
+              <w:t xml:space="preserve">Required</w:t>
+            </w:r>
+          </w:p>
+        </w:tc>
+        <w:tc>
+          <w:tcPr>
+            <w:tcMar>
+              <w:top w:w="0.0" w:type="dxa"/>
+              <w:left w:w="0.0" w:type="dxa"/>
+              <w:bottom w:w="0.0" w:type="dxa"/>
+              <w:right w:w="0.0" w:type="dxa"/>
+            </w:tcMar>
+            <w:vAlign w:val="center"/>
+          </w:tcPr>
+          <w:p>
+            <w:pPr>
+              <w:tabs>
+                <w:tab w:val="left" w:leader="none" w:pos="533"/>
+              </w:tabs>
+              <w:spacing w:after="200" w:before="80" w:lineRule="auto"/>
+              <w:rPr>
+                <w:sz w:val="16"/>
+                <w:szCs w:val="16"/>
+              </w:rPr>
+            </w:pPr>
+            <w:r>
+              <w:rPr>
+                <w:sz w:val="16"/>
+                <w:szCs w:val="16"/>
+                <w:rtl w:val="0"/>
+              </w:rPr>
+              <w:t xml:space="preserve">None</w:t>
+            </w:r>
+          </w:p>
+        </w:tc>
+        <w:tc>
+          <w:tcPr>
+            <w:tcMar>
+              <w:top w:w="0.0" w:type="dxa"/>
+              <w:left w:w="0.0" w:type="dxa"/>
+              <w:bottom w:w="0.0" w:type="dxa"/>
+              <w:right w:w="0.0" w:type="dxa"/>
+            </w:tcMar>
+            <w:vAlign w:val="center"/>
+          </w:tcPr>
+          <w:p>
+            <w:pPr>
+              <w:tabs>
+                <w:tab w:val="left" w:leader="none" w:pos="533"/>
+              </w:tabs>
+              <w:spacing w:after="200" w:before="80" w:lineRule="auto"/>
+              <w:rPr>
+                <w:sz w:val="16"/>
+                <w:szCs w:val="16"/>
+              </w:rPr>
+            </w:pPr>
+            <w:r>
+              <w:rPr>
+                <w:sz w:val="16"/>
+                <w:szCs w:val="16"/>
+                <w:rtl w:val="0"/>
+              </w:rPr>
+              <w:t xml:space="preserve">Required</w:t>
             </w:r>
           </w:p>
         </w:tc>
@@ -3901,10 +4148,10 @@
         <w:tc>
           <w:tcPr>
             <w:tcMar>
-              <w:top w:w="14.399999999999999" w:type="dxa"/>
-              <w:left w:w="14.399999999999999" w:type="dxa"/>
-              <w:bottom w:w="14.399999999999999" w:type="dxa"/>
-              <w:right w:w="14.399999999999999" w:type="dxa"/>
+              <w:top w:w="0.0" w:type="dxa"/>
+              <w:left w:w="0.0" w:type="dxa"/>
+              <w:bottom w:w="0.0" w:type="dxa"/>
+              <w:right w:w="0.0" w:type="dxa"/>
             </w:tcMar>
             <w:vAlign w:val="center"/>
           </w:tcPr>
@@ -3927,136 +4174,136 @@
                 <w:szCs w:val="16"/>
                 <w:rtl w:val="0"/>
               </w:rPr>
-              <w:t xml:space="preserve">Cloud Dependency</w:t>
-            </w:r>
-            <w:r>
-              <w:rPr>
-                <w:rtl w:val="0"/>
-              </w:rPr>
-            </w:r>
-          </w:p>
-        </w:tc>
-        <w:tc>
-          <w:tcPr>
-            <w:tcMar>
-              <w:top w:w="14.399999999999999" w:type="dxa"/>
-              <w:left w:w="14.399999999999999" w:type="dxa"/>
-              <w:bottom w:w="14.399999999999999" w:type="dxa"/>
-              <w:right w:w="14.399999999999999" w:type="dxa"/>
-            </w:tcMar>
-            <w:vAlign w:val="center"/>
-          </w:tcPr>
-          <w:p>
-            <w:pPr>
-              <w:tabs>
-                <w:tab w:val="left" w:leader="none" w:pos="533"/>
-              </w:tabs>
-              <w:spacing w:after="200" w:before="80" w:lineRule="auto"/>
-              <w:rPr>
-                <w:sz w:val="16"/>
-                <w:szCs w:val="16"/>
-              </w:rPr>
-            </w:pPr>
-            <w:r>
-              <w:rPr>
-                <w:sz w:val="16"/>
-                <w:szCs w:val="16"/>
-                <w:rtl w:val="0"/>
-              </w:rPr>
-              <w:t xml:space="preserve">None</w:t>
-            </w:r>
-          </w:p>
-        </w:tc>
-        <w:tc>
-          <w:tcPr>
-            <w:tcMar>
-              <w:top w:w="14.399999999999999" w:type="dxa"/>
-              <w:left w:w="14.399999999999999" w:type="dxa"/>
-              <w:bottom w:w="14.399999999999999" w:type="dxa"/>
-              <w:right w:w="14.399999999999999" w:type="dxa"/>
-            </w:tcMar>
-            <w:vAlign w:val="center"/>
-          </w:tcPr>
-          <w:p>
-            <w:pPr>
-              <w:tabs>
-                <w:tab w:val="left" w:leader="none" w:pos="533"/>
-              </w:tabs>
-              <w:spacing w:after="200" w:before="80" w:lineRule="auto"/>
-              <w:rPr>
-                <w:sz w:val="16"/>
-                <w:szCs w:val="16"/>
-              </w:rPr>
-            </w:pPr>
-            <w:r>
-              <w:rPr>
-                <w:sz w:val="16"/>
-                <w:szCs w:val="16"/>
-                <w:rtl w:val="0"/>
-              </w:rPr>
-              <w:t xml:space="preserve">Required</w:t>
-            </w:r>
-          </w:p>
-        </w:tc>
-        <w:tc>
-          <w:tcPr>
-            <w:tcMar>
-              <w:top w:w="14.399999999999999" w:type="dxa"/>
-              <w:left w:w="14.399999999999999" w:type="dxa"/>
-              <w:bottom w:w="14.399999999999999" w:type="dxa"/>
-              <w:right w:w="14.399999999999999" w:type="dxa"/>
-            </w:tcMar>
-            <w:vAlign w:val="center"/>
-          </w:tcPr>
-          <w:p>
-            <w:pPr>
-              <w:tabs>
-                <w:tab w:val="left" w:leader="none" w:pos="533"/>
-              </w:tabs>
-              <w:spacing w:after="200" w:before="80" w:lineRule="auto"/>
-              <w:rPr>
-                <w:sz w:val="16"/>
-                <w:szCs w:val="16"/>
-              </w:rPr>
-            </w:pPr>
-            <w:r>
-              <w:rPr>
-                <w:sz w:val="16"/>
-                <w:szCs w:val="16"/>
-                <w:rtl w:val="0"/>
-              </w:rPr>
-              <w:t xml:space="preserve">None</w:t>
-            </w:r>
-          </w:p>
-        </w:tc>
-        <w:tc>
-          <w:tcPr>
-            <w:tcMar>
-              <w:top w:w="14.399999999999999" w:type="dxa"/>
-              <w:left w:w="14.399999999999999" w:type="dxa"/>
-              <w:bottom w:w="14.399999999999999" w:type="dxa"/>
-              <w:right w:w="14.399999999999999" w:type="dxa"/>
-            </w:tcMar>
-            <w:vAlign w:val="center"/>
-          </w:tcPr>
-          <w:p>
-            <w:pPr>
-              <w:tabs>
-                <w:tab w:val="left" w:leader="none" w:pos="533"/>
-              </w:tabs>
-              <w:spacing w:after="200" w:before="80" w:lineRule="auto"/>
-              <w:rPr>
-                <w:sz w:val="16"/>
-                <w:szCs w:val="16"/>
-              </w:rPr>
-            </w:pPr>
-            <w:r>
-              <w:rPr>
-                <w:sz w:val="16"/>
-                <w:szCs w:val="16"/>
-                <w:rtl w:val="0"/>
-              </w:rPr>
-              <w:t xml:space="preserve">Required</w:t>
+              <w:t xml:space="preserve">WHO Compliance</w:t>
+            </w:r>
+            <w:r>
+              <w:rPr>
+                <w:rtl w:val="0"/>
+              </w:rPr>
+            </w:r>
+          </w:p>
+        </w:tc>
+        <w:tc>
+          <w:tcPr>
+            <w:tcMar>
+              <w:top w:w="0.0" w:type="dxa"/>
+              <w:left w:w="0.0" w:type="dxa"/>
+              <w:bottom w:w="0.0" w:type="dxa"/>
+              <w:right w:w="0.0" w:type="dxa"/>
+            </w:tcMar>
+            <w:vAlign w:val="center"/>
+          </w:tcPr>
+          <w:p>
+            <w:pPr>
+              <w:tabs>
+                <w:tab w:val="left" w:leader="none" w:pos="533"/>
+              </w:tabs>
+              <w:spacing w:after="200" w:before="80" w:lineRule="auto"/>
+              <w:rPr>
+                <w:sz w:val="16"/>
+                <w:szCs w:val="16"/>
+              </w:rPr>
+            </w:pPr>
+            <w:r>
+              <w:rPr>
+                <w:sz w:val="16"/>
+                <w:szCs w:val="16"/>
+                <w:rtl w:val="0"/>
+              </w:rPr>
+              <w:t xml:space="preserve">Yes (Transparent Rules)</w:t>
+            </w:r>
+          </w:p>
+        </w:tc>
+        <w:tc>
+          <w:tcPr>
+            <w:tcMar>
+              <w:top w:w="0.0" w:type="dxa"/>
+              <w:left w:w="0.0" w:type="dxa"/>
+              <w:bottom w:w="0.0" w:type="dxa"/>
+              <w:right w:w="0.0" w:type="dxa"/>
+            </w:tcMar>
+            <w:vAlign w:val="center"/>
+          </w:tcPr>
+          <w:p>
+            <w:pPr>
+              <w:tabs>
+                <w:tab w:val="left" w:leader="none" w:pos="533"/>
+              </w:tabs>
+              <w:spacing w:after="200" w:before="80" w:lineRule="auto"/>
+              <w:rPr>
+                <w:sz w:val="16"/>
+                <w:szCs w:val="16"/>
+              </w:rPr>
+            </w:pPr>
+            <w:r>
+              <w:rPr>
+                <w:sz w:val="16"/>
+                <w:szCs w:val="16"/>
+                <w:rtl w:val="0"/>
+              </w:rPr>
+              <w:t xml:space="preserve">Partial</w:t>
+            </w:r>
+          </w:p>
+        </w:tc>
+        <w:tc>
+          <w:tcPr>
+            <w:tcMar>
+              <w:top w:w="0.0" w:type="dxa"/>
+              <w:left w:w="0.0" w:type="dxa"/>
+              <w:bottom w:w="0.0" w:type="dxa"/>
+              <w:right w:w="0.0" w:type="dxa"/>
+            </w:tcMar>
+            <w:vAlign w:val="center"/>
+          </w:tcPr>
+          <w:p>
+            <w:pPr>
+              <w:tabs>
+                <w:tab w:val="left" w:leader="none" w:pos="533"/>
+              </w:tabs>
+              <w:spacing w:after="200" w:before="80" w:lineRule="auto"/>
+              <w:rPr>
+                <w:sz w:val="16"/>
+                <w:szCs w:val="16"/>
+              </w:rPr>
+            </w:pPr>
+            <w:r>
+              <w:rPr>
+                <w:sz w:val="16"/>
+                <w:szCs w:val="16"/>
+                <w:rtl w:val="0"/>
+              </w:rPr>
+              <w:t xml:space="preserve">Yes</w:t>
+            </w:r>
+          </w:p>
+        </w:tc>
+        <w:tc>
+          <w:tcPr>
+            <w:tcMar>
+              <w:top w:w="0.0" w:type="dxa"/>
+              <w:left w:w="0.0" w:type="dxa"/>
+              <w:bottom w:w="0.0" w:type="dxa"/>
+              <w:right w:w="0.0" w:type="dxa"/>
+            </w:tcMar>
+            <w:vAlign w:val="center"/>
+          </w:tcPr>
+          <w:p>
+            <w:pPr>
+              <w:tabs>
+                <w:tab w:val="left" w:leader="none" w:pos="533"/>
+              </w:tabs>
+              <w:spacing w:after="200" w:before="80" w:lineRule="auto"/>
+              <w:rPr>
+                <w:sz w:val="16"/>
+                <w:szCs w:val="16"/>
+              </w:rPr>
+            </w:pPr>
+            <w:r>
+              <w:rPr>
+                <w:sz w:val="16"/>
+                <w:szCs w:val="16"/>
+                <w:rtl w:val="0"/>
+              </w:rPr>
+              <w:t xml:space="preserve">Partial</w:t>
             </w:r>
           </w:p>
         </w:tc>
@@ -4069,10 +4316,10 @@
         <w:tc>
           <w:tcPr>
             <w:tcMar>
-              <w:top w:w="14.399999999999999" w:type="dxa"/>
-              <w:left w:w="14.399999999999999" w:type="dxa"/>
-              <w:bottom w:w="14.399999999999999" w:type="dxa"/>
-              <w:right w:w="14.399999999999999" w:type="dxa"/>
+              <w:top w:w="0.0" w:type="dxa"/>
+              <w:left w:w="0.0" w:type="dxa"/>
+              <w:bottom w:w="0.0" w:type="dxa"/>
+              <w:right w:w="0.0" w:type="dxa"/>
             </w:tcMar>
             <w:vAlign w:val="center"/>
           </w:tcPr>
@@ -4095,136 +4342,136 @@
                 <w:szCs w:val="16"/>
                 <w:rtl w:val="0"/>
               </w:rPr>
-              <w:t xml:space="preserve">WHO Compliance</w:t>
-            </w:r>
-            <w:r>
-              <w:rPr>
-                <w:rtl w:val="0"/>
-              </w:rPr>
-            </w:r>
-          </w:p>
-        </w:tc>
-        <w:tc>
-          <w:tcPr>
-            <w:tcMar>
-              <w:top w:w="14.399999999999999" w:type="dxa"/>
-              <w:left w:w="14.399999999999999" w:type="dxa"/>
-              <w:bottom w:w="14.399999999999999" w:type="dxa"/>
-              <w:right w:w="14.399999999999999" w:type="dxa"/>
-            </w:tcMar>
-            <w:vAlign w:val="center"/>
-          </w:tcPr>
-          <w:p>
-            <w:pPr>
-              <w:tabs>
-                <w:tab w:val="left" w:leader="none" w:pos="533"/>
-              </w:tabs>
-              <w:spacing w:after="200" w:before="80" w:lineRule="auto"/>
-              <w:rPr>
-                <w:sz w:val="16"/>
-                <w:szCs w:val="16"/>
-              </w:rPr>
-            </w:pPr>
-            <w:r>
-              <w:rPr>
-                <w:sz w:val="16"/>
-                <w:szCs w:val="16"/>
-                <w:rtl w:val="0"/>
-              </w:rPr>
-              <w:t xml:space="preserve">Yes (Transparent Rules)</w:t>
-            </w:r>
-          </w:p>
-        </w:tc>
-        <w:tc>
-          <w:tcPr>
-            <w:tcMar>
-              <w:top w:w="14.399999999999999" w:type="dxa"/>
-              <w:left w:w="14.399999999999999" w:type="dxa"/>
-              <w:bottom w:w="14.399999999999999" w:type="dxa"/>
-              <w:right w:w="14.399999999999999" w:type="dxa"/>
-            </w:tcMar>
-            <w:vAlign w:val="center"/>
-          </w:tcPr>
-          <w:p>
-            <w:pPr>
-              <w:tabs>
-                <w:tab w:val="left" w:leader="none" w:pos="533"/>
-              </w:tabs>
-              <w:spacing w:after="200" w:before="80" w:lineRule="auto"/>
-              <w:rPr>
-                <w:sz w:val="16"/>
-                <w:szCs w:val="16"/>
-              </w:rPr>
-            </w:pPr>
-            <w:r>
-              <w:rPr>
-                <w:sz w:val="16"/>
-                <w:szCs w:val="16"/>
-                <w:rtl w:val="0"/>
-              </w:rPr>
-              <w:t xml:space="preserve">Partial</w:t>
-            </w:r>
-          </w:p>
-        </w:tc>
-        <w:tc>
-          <w:tcPr>
-            <w:tcMar>
-              <w:top w:w="14.399999999999999" w:type="dxa"/>
-              <w:left w:w="14.399999999999999" w:type="dxa"/>
-              <w:bottom w:w="14.399999999999999" w:type="dxa"/>
-              <w:right w:w="14.399999999999999" w:type="dxa"/>
-            </w:tcMar>
-            <w:vAlign w:val="center"/>
-          </w:tcPr>
-          <w:p>
-            <w:pPr>
-              <w:tabs>
-                <w:tab w:val="left" w:leader="none" w:pos="533"/>
-              </w:tabs>
-              <w:spacing w:after="200" w:before="80" w:lineRule="auto"/>
-              <w:rPr>
-                <w:sz w:val="16"/>
-                <w:szCs w:val="16"/>
-              </w:rPr>
-            </w:pPr>
-            <w:r>
-              <w:rPr>
-                <w:sz w:val="16"/>
-                <w:szCs w:val="16"/>
-                <w:rtl w:val="0"/>
-              </w:rPr>
-              <w:t xml:space="preserve">Yes</w:t>
-            </w:r>
-          </w:p>
-        </w:tc>
-        <w:tc>
-          <w:tcPr>
-            <w:tcMar>
-              <w:top w:w="14.399999999999999" w:type="dxa"/>
-              <w:left w:w="14.399999999999999" w:type="dxa"/>
-              <w:bottom w:w="14.399999999999999" w:type="dxa"/>
-              <w:right w:w="14.399999999999999" w:type="dxa"/>
-            </w:tcMar>
-            <w:vAlign w:val="center"/>
-          </w:tcPr>
-          <w:p>
-            <w:pPr>
-              <w:tabs>
-                <w:tab w:val="left" w:leader="none" w:pos="533"/>
-              </w:tabs>
-              <w:spacing w:after="200" w:before="80" w:lineRule="auto"/>
-              <w:rPr>
-                <w:sz w:val="16"/>
-                <w:szCs w:val="16"/>
-              </w:rPr>
-            </w:pPr>
-            <w:r>
-              <w:rPr>
-                <w:sz w:val="16"/>
-                <w:szCs w:val="16"/>
-                <w:rtl w:val="0"/>
-              </w:rPr>
-              <w:t xml:space="preserve">Partial</w:t>
+              <w:t xml:space="preserve">Power Consumption</w:t>
+            </w:r>
+            <w:r>
+              <w:rPr>
+                <w:rtl w:val="0"/>
+              </w:rPr>
+            </w:r>
+          </w:p>
+        </w:tc>
+        <w:tc>
+          <w:tcPr>
+            <w:tcMar>
+              <w:top w:w="0.0" w:type="dxa"/>
+              <w:left w:w="0.0" w:type="dxa"/>
+              <w:bottom w:w="0.0" w:type="dxa"/>
+              <w:right w:w="0.0" w:type="dxa"/>
+            </w:tcMar>
+            <w:vAlign w:val="center"/>
+          </w:tcPr>
+          <w:p>
+            <w:pPr>
+              <w:tabs>
+                <w:tab w:val="left" w:leader="none" w:pos="533"/>
+              </w:tabs>
+              <w:spacing w:after="200" w:before="80" w:lineRule="auto"/>
+              <w:rPr>
+                <w:sz w:val="16"/>
+                <w:szCs w:val="16"/>
+              </w:rPr>
+            </w:pPr>
+            <w:r>
+              <w:rPr>
+                <w:sz w:val="16"/>
+                <w:szCs w:val="16"/>
+                <w:rtl w:val="0"/>
+              </w:rPr>
+              <w:t xml:space="preserve">Low (ESP32 Edge)</w:t>
+            </w:r>
+          </w:p>
+        </w:tc>
+        <w:tc>
+          <w:tcPr>
+            <w:tcMar>
+              <w:top w:w="0.0" w:type="dxa"/>
+              <w:left w:w="0.0" w:type="dxa"/>
+              <w:bottom w:w="0.0" w:type="dxa"/>
+              <w:right w:w="0.0" w:type="dxa"/>
+            </w:tcMar>
+            <w:vAlign w:val="center"/>
+          </w:tcPr>
+          <w:p>
+            <w:pPr>
+              <w:tabs>
+                <w:tab w:val="left" w:leader="none" w:pos="533"/>
+              </w:tabs>
+              <w:spacing w:after="200" w:before="80" w:lineRule="auto"/>
+              <w:rPr>
+                <w:sz w:val="16"/>
+                <w:szCs w:val="16"/>
+              </w:rPr>
+            </w:pPr>
+            <w:r>
+              <w:rPr>
+                <w:sz w:val="16"/>
+                <w:szCs w:val="16"/>
+                <w:rtl w:val="0"/>
+              </w:rPr>
+              <w:t xml:space="preserve">High</w:t>
+            </w:r>
+          </w:p>
+        </w:tc>
+        <w:tc>
+          <w:tcPr>
+            <w:tcMar>
+              <w:top w:w="0.0" w:type="dxa"/>
+              <w:left w:w="0.0" w:type="dxa"/>
+              <w:bottom w:w="0.0" w:type="dxa"/>
+              <w:right w:w="0.0" w:type="dxa"/>
+            </w:tcMar>
+            <w:vAlign w:val="center"/>
+          </w:tcPr>
+          <w:p>
+            <w:pPr>
+              <w:tabs>
+                <w:tab w:val="left" w:leader="none" w:pos="533"/>
+              </w:tabs>
+              <w:spacing w:after="200" w:before="80" w:lineRule="auto"/>
+              <w:rPr>
+                <w:sz w:val="16"/>
+                <w:szCs w:val="16"/>
+              </w:rPr>
+            </w:pPr>
+            <w:r>
+              <w:rPr>
+                <w:sz w:val="16"/>
+                <w:szCs w:val="16"/>
+                <w:rtl w:val="0"/>
+              </w:rPr>
+              <w:t xml:space="preserve">Low</w:t>
+            </w:r>
+          </w:p>
+        </w:tc>
+        <w:tc>
+          <w:tcPr>
+            <w:tcMar>
+              <w:top w:w="0.0" w:type="dxa"/>
+              <w:left w:w="0.0" w:type="dxa"/>
+              <w:bottom w:w="0.0" w:type="dxa"/>
+              <w:right w:w="0.0" w:type="dxa"/>
+            </w:tcMar>
+            <w:vAlign w:val="center"/>
+          </w:tcPr>
+          <w:p>
+            <w:pPr>
+              <w:tabs>
+                <w:tab w:val="left" w:leader="none" w:pos="533"/>
+              </w:tabs>
+              <w:spacing w:after="200" w:before="80" w:lineRule="auto"/>
+              <w:rPr>
+                <w:sz w:val="16"/>
+                <w:szCs w:val="16"/>
+              </w:rPr>
+            </w:pPr>
+            <w:r>
+              <w:rPr>
+                <w:sz w:val="16"/>
+                <w:szCs w:val="16"/>
+                <w:rtl w:val="0"/>
+              </w:rPr>
+              <w:t xml:space="preserve">Moderate</w:t>
             </w:r>
           </w:p>
         </w:tc>
@@ -4237,10 +4484,10 @@
         <w:tc>
           <w:tcPr>
             <w:tcMar>
-              <w:top w:w="14.399999999999999" w:type="dxa"/>
-              <w:left w:w="14.399999999999999" w:type="dxa"/>
-              <w:bottom w:w="14.399999999999999" w:type="dxa"/>
-              <w:right w:w="14.399999999999999" w:type="dxa"/>
+              <w:top w:w="0.0" w:type="dxa"/>
+              <w:left w:w="0.0" w:type="dxa"/>
+              <w:bottom w:w="0.0" w:type="dxa"/>
+              <w:right w:w="0.0" w:type="dxa"/>
             </w:tcMar>
             <w:vAlign w:val="center"/>
           </w:tcPr>
@@ -4263,136 +4510,136 @@
                 <w:szCs w:val="16"/>
                 <w:rtl w:val="0"/>
               </w:rPr>
-              <w:t xml:space="preserve">Power Consumption</w:t>
-            </w:r>
-            <w:r>
-              <w:rPr>
-                <w:rtl w:val="0"/>
-              </w:rPr>
-            </w:r>
-          </w:p>
-        </w:tc>
-        <w:tc>
-          <w:tcPr>
-            <w:tcMar>
-              <w:top w:w="14.399999999999999" w:type="dxa"/>
-              <w:left w:w="14.399999999999999" w:type="dxa"/>
-              <w:bottom w:w="14.399999999999999" w:type="dxa"/>
-              <w:right w:w="14.399999999999999" w:type="dxa"/>
-            </w:tcMar>
-            <w:vAlign w:val="center"/>
-          </w:tcPr>
-          <w:p>
-            <w:pPr>
-              <w:tabs>
-                <w:tab w:val="left" w:leader="none" w:pos="533"/>
-              </w:tabs>
-              <w:spacing w:after="200" w:before="80" w:lineRule="auto"/>
-              <w:rPr>
-                <w:sz w:val="16"/>
-                <w:szCs w:val="16"/>
-              </w:rPr>
-            </w:pPr>
-            <w:r>
-              <w:rPr>
-                <w:sz w:val="16"/>
-                <w:szCs w:val="16"/>
-                <w:rtl w:val="0"/>
-              </w:rPr>
-              <w:t xml:space="preserve">Low (ESP32 Edge)</w:t>
-            </w:r>
-          </w:p>
-        </w:tc>
-        <w:tc>
-          <w:tcPr>
-            <w:tcMar>
-              <w:top w:w="14.399999999999999" w:type="dxa"/>
-              <w:left w:w="14.399999999999999" w:type="dxa"/>
-              <w:bottom w:w="14.399999999999999" w:type="dxa"/>
-              <w:right w:w="14.399999999999999" w:type="dxa"/>
-            </w:tcMar>
-            <w:vAlign w:val="center"/>
-          </w:tcPr>
-          <w:p>
-            <w:pPr>
-              <w:tabs>
-                <w:tab w:val="left" w:leader="none" w:pos="533"/>
-              </w:tabs>
-              <w:spacing w:after="200" w:before="80" w:lineRule="auto"/>
-              <w:rPr>
-                <w:sz w:val="16"/>
-                <w:szCs w:val="16"/>
-              </w:rPr>
-            </w:pPr>
-            <w:r>
-              <w:rPr>
-                <w:sz w:val="16"/>
-                <w:szCs w:val="16"/>
-                <w:rtl w:val="0"/>
-              </w:rPr>
-              <w:t xml:space="preserve">High</w:t>
-            </w:r>
-          </w:p>
-        </w:tc>
-        <w:tc>
-          <w:tcPr>
-            <w:tcMar>
-              <w:top w:w="14.399999999999999" w:type="dxa"/>
-              <w:left w:w="14.399999999999999" w:type="dxa"/>
-              <w:bottom w:w="14.399999999999999" w:type="dxa"/>
-              <w:right w:w="14.399999999999999" w:type="dxa"/>
-            </w:tcMar>
-            <w:vAlign w:val="center"/>
-          </w:tcPr>
-          <w:p>
-            <w:pPr>
-              <w:tabs>
-                <w:tab w:val="left" w:leader="none" w:pos="533"/>
-              </w:tabs>
-              <w:spacing w:after="200" w:before="80" w:lineRule="auto"/>
-              <w:rPr>
-                <w:sz w:val="16"/>
-                <w:szCs w:val="16"/>
-              </w:rPr>
-            </w:pPr>
-            <w:r>
-              <w:rPr>
-                <w:sz w:val="16"/>
-                <w:szCs w:val="16"/>
-                <w:rtl w:val="0"/>
-              </w:rPr>
-              <w:t xml:space="preserve">Low</w:t>
-            </w:r>
-          </w:p>
-        </w:tc>
-        <w:tc>
-          <w:tcPr>
-            <w:tcMar>
-              <w:top w:w="14.399999999999999" w:type="dxa"/>
-              <w:left w:w="14.399999999999999" w:type="dxa"/>
-              <w:bottom w:w="14.399999999999999" w:type="dxa"/>
-              <w:right w:w="14.399999999999999" w:type="dxa"/>
-            </w:tcMar>
-            <w:vAlign w:val="center"/>
-          </w:tcPr>
-          <w:p>
-            <w:pPr>
-              <w:tabs>
-                <w:tab w:val="left" w:leader="none" w:pos="533"/>
-              </w:tabs>
-              <w:spacing w:after="200" w:before="80" w:lineRule="auto"/>
-              <w:rPr>
-                <w:sz w:val="16"/>
-                <w:szCs w:val="16"/>
-              </w:rPr>
-            </w:pPr>
-            <w:r>
-              <w:rPr>
-                <w:sz w:val="16"/>
-                <w:szCs w:val="16"/>
-                <w:rtl w:val="0"/>
-              </w:rPr>
-              <w:t xml:space="preserve">Moderate</w:t>
+              <w:t xml:space="preserve">Cost</w:t>
+            </w:r>
+            <w:r>
+              <w:rPr>
+                <w:rtl w:val="0"/>
+              </w:rPr>
+            </w:r>
+          </w:p>
+        </w:tc>
+        <w:tc>
+          <w:tcPr>
+            <w:tcMar>
+              <w:top w:w="0.0" w:type="dxa"/>
+              <w:left w:w="0.0" w:type="dxa"/>
+              <w:bottom w:w="0.0" w:type="dxa"/>
+              <w:right w:w="0.0" w:type="dxa"/>
+            </w:tcMar>
+            <w:vAlign w:val="center"/>
+          </w:tcPr>
+          <w:p>
+            <w:pPr>
+              <w:tabs>
+                <w:tab w:val="left" w:leader="none" w:pos="533"/>
+              </w:tabs>
+              <w:spacing w:after="200" w:before="80" w:lineRule="auto"/>
+              <w:rPr>
+                <w:sz w:val="16"/>
+                <w:szCs w:val="16"/>
+              </w:rPr>
+            </w:pPr>
+            <w:r>
+              <w:rPr>
+                <w:sz w:val="16"/>
+                <w:szCs w:val="16"/>
+                <w:rtl w:val="0"/>
+              </w:rPr>
+              <w:t xml:space="preserve">Low (~$15)</w:t>
+            </w:r>
+          </w:p>
+        </w:tc>
+        <w:tc>
+          <w:tcPr>
+            <w:tcMar>
+              <w:top w:w="0.0" w:type="dxa"/>
+              <w:left w:w="0.0" w:type="dxa"/>
+              <w:bottom w:w="0.0" w:type="dxa"/>
+              <w:right w:w="0.0" w:type="dxa"/>
+            </w:tcMar>
+            <w:vAlign w:val="center"/>
+          </w:tcPr>
+          <w:p>
+            <w:pPr>
+              <w:tabs>
+                <w:tab w:val="left" w:leader="none" w:pos="533"/>
+              </w:tabs>
+              <w:spacing w:after="200" w:before="80" w:lineRule="auto"/>
+              <w:rPr>
+                <w:sz w:val="16"/>
+                <w:szCs w:val="16"/>
+              </w:rPr>
+            </w:pPr>
+            <w:r>
+              <w:rPr>
+                <w:sz w:val="16"/>
+                <w:szCs w:val="16"/>
+                <w:rtl w:val="0"/>
+              </w:rPr>
+              <w:t xml:space="preserve">High (~$80+)</w:t>
+            </w:r>
+          </w:p>
+        </w:tc>
+        <w:tc>
+          <w:tcPr>
+            <w:tcMar>
+              <w:top w:w="0.0" w:type="dxa"/>
+              <w:left w:w="0.0" w:type="dxa"/>
+              <w:bottom w:w="0.0" w:type="dxa"/>
+              <w:right w:w="0.0" w:type="dxa"/>
+            </w:tcMar>
+            <w:vAlign w:val="center"/>
+          </w:tcPr>
+          <w:p>
+            <w:pPr>
+              <w:tabs>
+                <w:tab w:val="left" w:leader="none" w:pos="533"/>
+              </w:tabs>
+              <w:spacing w:after="200" w:before="80" w:lineRule="auto"/>
+              <w:rPr>
+                <w:sz w:val="16"/>
+                <w:szCs w:val="16"/>
+              </w:rPr>
+            </w:pPr>
+            <w:r>
+              <w:rPr>
+                <w:sz w:val="16"/>
+                <w:szCs w:val="16"/>
+                <w:rtl w:val="0"/>
+              </w:rPr>
+              <w:t xml:space="preserve">Low (~$10)</w:t>
+            </w:r>
+          </w:p>
+        </w:tc>
+        <w:tc>
+          <w:tcPr>
+            <w:tcMar>
+              <w:top w:w="0.0" w:type="dxa"/>
+              <w:left w:w="0.0" w:type="dxa"/>
+              <w:bottom w:w="0.0" w:type="dxa"/>
+              <w:right w:w="0.0" w:type="dxa"/>
+            </w:tcMar>
+            <w:vAlign w:val="center"/>
+          </w:tcPr>
+          <w:p>
+            <w:pPr>
+              <w:tabs>
+                <w:tab w:val="left" w:leader="none" w:pos="533"/>
+              </w:tabs>
+              <w:spacing w:after="200" w:before="80" w:lineRule="auto"/>
+              <w:rPr>
+                <w:sz w:val="16"/>
+                <w:szCs w:val="16"/>
+              </w:rPr>
+            </w:pPr>
+            <w:r>
+              <w:rPr>
+                <w:sz w:val="16"/>
+                <w:szCs w:val="16"/>
+                <w:rtl w:val="0"/>
+              </w:rPr>
+              <w:t xml:space="preserve">High (~$100+)</w:t>
             </w:r>
           </w:p>
         </w:tc>
@@ -4405,10 +4652,10 @@
         <w:tc>
           <w:tcPr>
             <w:tcMar>
-              <w:top w:w="14.399999999999999" w:type="dxa"/>
-              <w:left w:w="14.399999999999999" w:type="dxa"/>
-              <w:bottom w:w="14.399999999999999" w:type="dxa"/>
-              <w:right w:w="14.399999999999999" w:type="dxa"/>
+              <w:top w:w="0.0" w:type="dxa"/>
+              <w:left w:w="0.0" w:type="dxa"/>
+              <w:bottom w:w="0.0" w:type="dxa"/>
+              <w:right w:w="0.0" w:type="dxa"/>
             </w:tcMar>
             <w:vAlign w:val="center"/>
           </w:tcPr>
@@ -4431,174 +4678,6 @@
                 <w:szCs w:val="16"/>
                 <w:rtl w:val="0"/>
               </w:rPr>
-              <w:t xml:space="preserve">Cost</w:t>
-            </w:r>
-            <w:r>
-              <w:rPr>
-                <w:rtl w:val="0"/>
-              </w:rPr>
-            </w:r>
-          </w:p>
-        </w:tc>
-        <w:tc>
-          <w:tcPr>
-            <w:tcMar>
-              <w:top w:w="14.399999999999999" w:type="dxa"/>
-              <w:left w:w="14.399999999999999" w:type="dxa"/>
-              <w:bottom w:w="14.399999999999999" w:type="dxa"/>
-              <w:right w:w="14.399999999999999" w:type="dxa"/>
-            </w:tcMar>
-            <w:vAlign w:val="center"/>
-          </w:tcPr>
-          <w:p>
-            <w:pPr>
-              <w:tabs>
-                <w:tab w:val="left" w:leader="none" w:pos="533"/>
-              </w:tabs>
-              <w:spacing w:after="200" w:before="80" w:lineRule="auto"/>
-              <w:rPr>
-                <w:sz w:val="16"/>
-                <w:szCs w:val="16"/>
-              </w:rPr>
-            </w:pPr>
-            <w:r>
-              <w:rPr>
-                <w:sz w:val="16"/>
-                <w:szCs w:val="16"/>
-                <w:rtl w:val="0"/>
-              </w:rPr>
-              <w:t xml:space="preserve">Low (~$15)</w:t>
-            </w:r>
-          </w:p>
-        </w:tc>
-        <w:tc>
-          <w:tcPr>
-            <w:tcMar>
-              <w:top w:w="14.399999999999999" w:type="dxa"/>
-              <w:left w:w="14.399999999999999" w:type="dxa"/>
-              <w:bottom w:w="14.399999999999999" w:type="dxa"/>
-              <w:right w:w="14.399999999999999" w:type="dxa"/>
-            </w:tcMar>
-            <w:vAlign w:val="center"/>
-          </w:tcPr>
-          <w:p>
-            <w:pPr>
-              <w:tabs>
-                <w:tab w:val="left" w:leader="none" w:pos="533"/>
-              </w:tabs>
-              <w:spacing w:after="200" w:before="80" w:lineRule="auto"/>
-              <w:rPr>
-                <w:sz w:val="16"/>
-                <w:szCs w:val="16"/>
-              </w:rPr>
-            </w:pPr>
-            <w:r>
-              <w:rPr>
-                <w:sz w:val="16"/>
-                <w:szCs w:val="16"/>
-                <w:rtl w:val="0"/>
-              </w:rPr>
-              <w:t xml:space="preserve">High (~$80+)</w:t>
-            </w:r>
-          </w:p>
-        </w:tc>
-        <w:tc>
-          <w:tcPr>
-            <w:tcMar>
-              <w:top w:w="14.399999999999999" w:type="dxa"/>
-              <w:left w:w="14.399999999999999" w:type="dxa"/>
-              <w:bottom w:w="14.399999999999999" w:type="dxa"/>
-              <w:right w:w="14.399999999999999" w:type="dxa"/>
-            </w:tcMar>
-            <w:vAlign w:val="center"/>
-          </w:tcPr>
-          <w:p>
-            <w:pPr>
-              <w:tabs>
-                <w:tab w:val="left" w:leader="none" w:pos="533"/>
-              </w:tabs>
-              <w:spacing w:after="200" w:before="80" w:lineRule="auto"/>
-              <w:rPr>
-                <w:sz w:val="16"/>
-                <w:szCs w:val="16"/>
-              </w:rPr>
-            </w:pPr>
-            <w:r>
-              <w:rPr>
-                <w:sz w:val="16"/>
-                <w:szCs w:val="16"/>
-                <w:rtl w:val="0"/>
-              </w:rPr>
-              <w:t xml:space="preserve">Low (~$10)</w:t>
-            </w:r>
-          </w:p>
-        </w:tc>
-        <w:tc>
-          <w:tcPr>
-            <w:tcMar>
-              <w:top w:w="14.399999999999999" w:type="dxa"/>
-              <w:left w:w="14.399999999999999" w:type="dxa"/>
-              <w:bottom w:w="14.399999999999999" w:type="dxa"/>
-              <w:right w:w="14.399999999999999" w:type="dxa"/>
-            </w:tcMar>
-            <w:vAlign w:val="center"/>
-          </w:tcPr>
-          <w:p>
-            <w:pPr>
-              <w:tabs>
-                <w:tab w:val="left" w:leader="none" w:pos="533"/>
-              </w:tabs>
-              <w:spacing w:after="200" w:before="80" w:lineRule="auto"/>
-              <w:rPr>
-                <w:sz w:val="16"/>
-                <w:szCs w:val="16"/>
-              </w:rPr>
-            </w:pPr>
-            <w:r>
-              <w:rPr>
-                <w:sz w:val="16"/>
-                <w:szCs w:val="16"/>
-                <w:rtl w:val="0"/>
-              </w:rPr>
-              <w:t xml:space="preserve">High (~$100+)</w:t>
-            </w:r>
-          </w:p>
-        </w:tc>
-      </w:tr>
-      <w:tr>
-        <w:trPr>
-          <w:cantSplit w:val="0"/>
-          <w:tblHeader w:val="0"/>
-        </w:trPr>
-        <w:tc>
-          <w:tcPr>
-            <w:tcMar>
-              <w:top w:w="14.399999999999999" w:type="dxa"/>
-              <w:left w:w="14.399999999999999" w:type="dxa"/>
-              <w:bottom w:w="14.399999999999999" w:type="dxa"/>
-              <w:right w:w="14.399999999999999" w:type="dxa"/>
-            </w:tcMar>
-            <w:vAlign w:val="center"/>
-          </w:tcPr>
-          <w:p>
-            <w:pPr>
-              <w:tabs>
-                <w:tab w:val="left" w:leader="none" w:pos="533"/>
-              </w:tabs>
-              <w:spacing w:after="200" w:before="80" w:lineRule="auto"/>
-              <w:rPr>
-                <w:sz w:val="16"/>
-                <w:szCs w:val="16"/>
-              </w:rPr>
-            </w:pPr>
-            <w:r>
-              <w:rPr>
-                <w:b w:val="1"/>
-                <w:bCs w:val="1"/>
-                <w:sz w:val="16"/>
-                <w:szCs w:val="16"/>
-                <w:rtl w:val="0"/>
-              </w:rPr>
               <w:t xml:space="preserve">Deployment</w:t>
             </w:r>
             <w:r>
@@ -4611,10 +4690,10 @@
         <w:tc>
           <w:tcPr>
             <w:tcMar>
-              <w:top w:w="14.399999999999999" w:type="dxa"/>
-              <w:left w:w="14.399999999999999" w:type="dxa"/>
-              <w:bottom w:w="14.399999999999999" w:type="dxa"/>
-              <w:right w:w="14.399999999999999" w:type="dxa"/>
+              <w:top w:w="0.0" w:type="dxa"/>
+              <w:left w:w="0.0" w:type="dxa"/>
+              <w:bottom w:w="0.0" w:type="dxa"/>
+              <w:right w:w="0.0" w:type="dxa"/>
             </w:tcMar>
             <w:vAlign w:val="center"/>
           </w:tcPr>
@@ -4642,10 +4721,10 @@
         <w:tc>
           <w:tcPr>
             <w:tcMar>
-              <w:top w:w="14.399999999999999" w:type="dxa"/>
-              <w:left w:w="14.399999999999999" w:type="dxa"/>
-              <w:bottom w:w="14.399999999999999" w:type="dxa"/>
-              <w:right w:w="14.399999999999999" w:type="dxa"/>
+              <w:top w:w="0.0" w:type="dxa"/>
+              <w:left w:w="0.0" w:type="dxa"/>
+              <w:bottom w:w="0.0" w:type="dxa"/>
+              <w:right w:w="0.0" w:type="dxa"/>
             </w:tcMar>
             <w:vAlign w:val="center"/>
           </w:tcPr>
@@ -4673,10 +4752,10 @@
         <w:tc>
           <w:tcPr>
             <w:tcMar>
-              <w:top w:w="14.399999999999999" w:type="dxa"/>
-              <w:left w:w="14.399999999999999" w:type="dxa"/>
-              <w:bottom w:w="14.399999999999999" w:type="dxa"/>
-              <w:right w:w="14.399999999999999" w:type="dxa"/>
+              <w:top w:w="0.0" w:type="dxa"/>
+              <w:left w:w="0.0" w:type="dxa"/>
+              <w:bottom w:w="0.0" w:type="dxa"/>
+              <w:right w:w="0.0" w:type="dxa"/>
             </w:tcMar>
             <w:vAlign w:val="center"/>
           </w:tcPr>
@@ -4704,10 +4783,10 @@
         <w:tc>
           <w:tcPr>
             <w:tcMar>
-              <w:top w:w="14.399999999999999" w:type="dxa"/>
-              <w:left w:w="14.399999999999999" w:type="dxa"/>
-              <w:bottom w:w="14.399999999999999" w:type="dxa"/>
-              <w:right w:w="14.399999999999999" w:type="dxa"/>
+              <w:top w:w="0.0" w:type="dxa"/>
+              <w:left w:w="0.0" w:type="dxa"/>
+              <w:bottom w:w="0.0" w:type="dxa"/>
+              <w:right w:w="0.0" w:type="dxa"/>
             </w:tcMar>
             <w:vAlign w:val="center"/>
           </w:tcPr>
@@ -4742,6 +4821,7 @@
           <w:numId w:val="1"/>
         </w:numPr>
         <w:tabs>
+          <w:tab w:val="left" w:leader="none" w:pos="216"/>
           <w:tab w:val="left" w:leader="none" w:pos="216"/>
         </w:tabs>
         <w:ind w:left="0" w:firstLine="216"/>
@@ -4813,6 +4893,7 @@
         <w:pStyle w:val="Heading5"/>
         <w:tabs>
           <w:tab w:val="left" w:leader="none" w:pos="360"/>
+          <w:tab w:val="left" w:leader="none" w:pos="360"/>
         </w:tabs>
         <w:rPr/>
       </w:pPr>
@@ -4821,11 +4902,6 @@
           <w:rtl w:val="0"/>
         </w:rPr>
         <w:t xml:space="preserve">Acknowledgment</w:t>
-      </w:r>
-      <w:r>
-        <w:rPr>
-          <w:rtl w:val="0"/>
-        </w:rPr>
       </w:r>
     </w:p>
     <w:p>
@@ -4833,6 +4909,7 @@
         <w:pStyle w:val="Heading5"/>
         <w:tabs>
           <w:tab w:val="left" w:leader="none" w:pos="360"/>
+          <w:tab w:val="left" w:leader="none" w:pos="360"/>
         </w:tabs>
         <w:jc w:val="both"/>
         <w:rPr>
@@ -4852,6 +4929,7 @@
         <w:pStyle w:val="Heading5"/>
         <w:tabs>
           <w:tab w:val="left" w:leader="none" w:pos="360"/>
+          <w:tab w:val="left" w:leader="none" w:pos="360"/>
         </w:tabs>
         <w:rPr/>
       </w:pPr>
@@ -4865,6 +4943,7 @@
       <w:pPr>
         <w:pStyle w:val="Heading5"/>
         <w:tabs>
+          <w:tab w:val="left" w:leader="none" w:pos="360"/>
           <w:tab w:val="left" w:leader="none" w:pos="360"/>
         </w:tabs>
         <w:rPr/>
@@ -4883,8 +4962,9 @@
           <w:numId w:val="2"/>
         </w:numPr>
         <w:spacing w:after="50" w:line="180" w:lineRule="auto"/>
-        <w:ind w:left="360"/>
+        <w:ind w:left="360" w:hanging="360"/>
         <w:jc w:val="left"/>
+        <w:rPr/>
       </w:pPr>
       <w:r>
         <w:rPr>
@@ -4893,22 +4973,6 @@
           <w:rtl w:val="0"/>
         </w:rPr>
         <w:t xml:space="preserve"> Y. Gao, L. Zhang, and H. Wang, "Cloud-based machine learning for pharmaceutical cold chain temperature prediction," IEEE Internet of Things Journal, vol. 11, no. 3, pp. 4521-4533, February 2024.</w:t>
-      </w:r>
-    </w:p>
-    <w:p>
-      <w:pPr>
-        <w:spacing w:after="50" w:line="180" w:lineRule="auto"/>
-        <w:ind w:left="360" w:firstLine="0"/>
-        <w:jc w:val="left"/>
-        <w:rPr>
-          <w:sz w:val="16"/>
-          <w:szCs w:val="16"/>
-        </w:rPr>
-      </w:pPr>
-      <w:r>
-        <w:rPr>
-          <w:rtl w:val="0"/>
-        </w:rPr>
       </w:r>
     </w:p>
     <w:p>
@@ -4918,8 +4982,9 @@
           <w:numId w:val="2"/>
         </w:numPr>
         <w:spacing w:after="50" w:line="180" w:lineRule="auto"/>
-        <w:ind w:left="360"/>
+        <w:ind w:left="360" w:hanging="360"/>
         <w:jc w:val="left"/>
+        <w:rPr/>
       </w:pPr>
       <w:r>
         <w:rPr>
@@ -4928,6 +4993,11 @@
           <w:rtl w:val="0"/>
         </w:rPr>
         <w:t xml:space="preserve">R. Kumar and S. Patel, "Low-cost IoT-based vaccine cold chain monitoring system with threshold alerts," Journal of Embedded Systems, vol. 15, no. 2, pp. 112-125, March 2023.</w:t>
+      </w:r>
+      <w:r>
+        <w:rPr>
+          <w:rtl w:val="0"/>
+        </w:rPr>
       </w:r>
     </w:p>
     <w:p>
@@ -4953,8 +5023,9 @@
           <w:numId w:val="2"/>
         </w:numPr>
         <w:spacing w:after="50" w:line="180" w:lineRule="auto"/>
-        <w:ind w:left="360"/>
+        <w:ind w:left="360" w:hanging="360"/>
         <w:jc w:val="left"/>
+        <w:rPr/>
       </w:pPr>
       <w:r>
         <w:rPr>
@@ -4963,22 +5034,6 @@
           <w:rtl w:val="0"/>
         </w:rPr>
         <w:t xml:space="preserve">X. Chen, M. Liu, and K. Zhao, "Deep learning approach for cold chain logistics anomaly detection using multi-sensor fusion," IEEE Transactions on Industrial Informatics, vol. 21, no. 1, pp. 234-246, January 2025.</w:t>
-      </w:r>
-    </w:p>
-    <w:p>
-      <w:pPr>
-        <w:spacing w:after="50" w:line="180" w:lineRule="auto"/>
-        <w:ind w:left="360" w:firstLine="0"/>
-        <w:jc w:val="left"/>
-        <w:rPr>
-          <w:sz w:val="16"/>
-          <w:szCs w:val="16"/>
-        </w:rPr>
-      </w:pPr>
-      <w:r>
-        <w:rPr>
-          <w:rtl w:val="0"/>
-        </w:rPr>
       </w:r>
     </w:p>
     <w:p>
@@ -4988,8 +5043,9 @@
           <w:numId w:val="2"/>
         </w:numPr>
         <w:spacing w:after="50" w:line="180" w:lineRule="auto"/>
-        <w:ind w:left="360"/>
+        <w:ind w:left="360" w:hanging="360"/>
         <w:jc w:val="left"/>
+        <w:rPr/>
       </w:pPr>
       <w:r>
         <w:rPr>
@@ -4998,22 +5054,6 @@
           <w:rtl w:val="0"/>
         </w:rPr>
         <w:t xml:space="preserve">World Health Organization, "WHO Guidelines on the International Packaging and Shipping of Vaccines," WHO Technical Report Series, Geneva, 2023.</w:t>
-      </w:r>
-    </w:p>
-    <w:p>
-      <w:pPr>
-        <w:spacing w:after="50" w:line="180" w:lineRule="auto"/>
-        <w:ind w:left="360" w:firstLine="0"/>
-        <w:jc w:val="left"/>
-        <w:rPr>
-          <w:sz w:val="16"/>
-          <w:szCs w:val="16"/>
-        </w:rPr>
-      </w:pPr>
-      <w:r>
-        <w:rPr>
-          <w:rtl w:val="0"/>
-        </w:rPr>
       </w:r>
     </w:p>
     <w:p>
@@ -5023,8 +5063,9 @@
           <w:numId w:val="2"/>
         </w:numPr>
         <w:spacing w:after="50" w:line="180" w:lineRule="auto"/>
-        <w:ind w:left="360"/>
+        <w:ind w:left="360" w:hanging="360"/>
         <w:jc w:val="left"/>
+        <w:rPr/>
       </w:pPr>
       <w:r>
         <w:rPr>
@@ -5033,22 +5074,6 @@
           <w:rtl w:val="0"/>
         </w:rPr>
         <w:t xml:space="preserve">P. Warden and D. Situnayake, "TinyML: Machine Learning with TensorFlow Lite on Arduino and Ultra-Low-Power Microcontrollers," O'Reilly Media, 2020.</w:t>
-      </w:r>
-    </w:p>
-    <w:p>
-      <w:pPr>
-        <w:spacing w:after="50" w:line="180" w:lineRule="auto"/>
-        <w:ind w:left="360" w:firstLine="0"/>
-        <w:jc w:val="left"/>
-        <w:rPr>
-          <w:sz w:val="16"/>
-          <w:szCs w:val="16"/>
-        </w:rPr>
-      </w:pPr>
-      <w:r>
-        <w:rPr>
-          <w:rtl w:val="0"/>
-        </w:rPr>
       </w:r>
     </w:p>
     <w:p>
@@ -5058,8 +5083,9 @@
           <w:numId w:val="2"/>
         </w:numPr>
         <w:spacing w:after="50" w:line="180" w:lineRule="auto"/>
-        <w:ind w:left="360"/>
+        <w:ind w:left="360" w:hanging="360"/>
         <w:jc w:val="left"/>
+        <w:rPr/>
       </w:pPr>
       <w:r>
         <w:rPr>
@@ -5068,22 +5094,6 @@
           <w:rtl w:val="0"/>
         </w:rPr>
         <w:t xml:space="preserve">Espressif Systems, "ESP32 Technical Reference Manual," Version 4.8, 2024. [Online]. Available: https://www.espressif.com/documentation</w:t>
-      </w:r>
-    </w:p>
-    <w:p>
-      <w:pPr>
-        <w:spacing w:after="50" w:line="180" w:lineRule="auto"/>
-        <w:ind w:left="360" w:firstLine="0"/>
-        <w:jc w:val="left"/>
-        <w:rPr>
-          <w:sz w:val="16"/>
-          <w:szCs w:val="16"/>
-        </w:rPr>
-      </w:pPr>
-      <w:r>
-        <w:rPr>
-          <w:rtl w:val="0"/>
-        </w:rPr>
       </w:r>
     </w:p>
     <w:p>
@@ -5194,45 +5204,6 @@
           <w:shd w:fill="auto" w:val="clear"/>
           <w:vertAlign w:val="baseline"/>
         </w:rPr>
-      </w:pPr>
-      <w:r>
-        <w:rPr>
-          <w:rtl w:val="0"/>
-        </w:rPr>
-      </w:r>
-    </w:p>
-    <w:p>
-      <w:pPr>
-        <w:keepNext w:val="0"/>
-        <w:keepLines w:val="0"/>
-        <w:pageBreakBefore w:val="0"/>
-        <w:widowControl w:val="1"/>
-        <w:pBdr>
-          <w:top w:space="0" w:sz="0" w:val="nil"/>
-          <w:left w:space="0" w:sz="0" w:val="nil"/>
-          <w:bottom w:space="0" w:sz="0" w:val="nil"/>
-          <w:right w:space="0" w:sz="0" w:val="nil"/>
-          <w:between w:space="0" w:sz="0" w:val="nil"/>
-        </w:pBdr>
-        <w:shd w:fill="auto" w:val="clear"/>
-        <w:spacing w:after="50" w:before="0" w:line="240" w:lineRule="auto"/>
-        <w:ind w:left="0" w:right="0" w:firstLine="0"/>
-        <w:jc w:val="left"/>
-        <w:rPr>
-          <w:rFonts w:ascii="Times New Roman" w:cs="Times New Roman" w:eastAsia="Times New Roman" w:hAnsi="Times New Roman"/>
-          <w:b w:val="1"/>
-          <w:bCs w:val="1"/>
-          <w:i w:val="0"/>
-          <w:iCs w:val="0"/>
-          <w:smallCaps w:val="0"/>
-          <w:strike w:val="0"/>
-          <w:color w:val="ff0000"/>
-          <w:sz w:val="20"/>
-          <w:szCs w:val="20"/>
-          <w:u w:val="none"/>
-          <w:shd w:fill="auto" w:val="clear"/>
-          <w:vertAlign w:val="baseline"/>
-        </w:rPr>
         <w:sectPr>
           <w:type w:val="continuous"/>
           <w:pgSz w:h="16838" w:w="11906" w:orient="portrait"/>
@@ -5274,7 +5245,6 @@
     <w:pPr>
       <w:keepNext w:val="0"/>
       <w:keepLines w:val="0"/>
-      <w:pageBreakBefore w:val="0"/>
       <w:widowControl w:val="1"/>
       <w:pBdr>
         <w:top w:space="0" w:sz="0" w:val="nil"/>
@@ -5723,44 +5693,7 @@
     <w:tblPr>
       <w:tblStyleRowBandSize w:val="1"/>
       <w:tblStyleColBandSize w:val="1"/>
-      <w:tblCellMar/>
     </w:tblPr>
-    <w:tblStylePr w:type="band1Horz">
-      <w:tcPr/>
-    </w:tblStylePr>
-    <w:tblStylePr w:type="band1Vert">
-      <w:tcPr/>
-    </w:tblStylePr>
-    <w:tblStylePr w:type="band2Horz">
-      <w:tcPr/>
-    </w:tblStylePr>
-    <w:tblStylePr w:type="band2Vert">
-      <w:tcPr/>
-    </w:tblStylePr>
-    <w:tblStylePr w:type="firstCol">
-      <w:tcPr/>
-    </w:tblStylePr>
-    <w:tblStylePr w:type="firstRow">
-      <w:tcPr/>
-    </w:tblStylePr>
-    <w:tblStylePr w:type="lastCol">
-      <w:tcPr/>
-    </w:tblStylePr>
-    <w:tblStylePr w:type="lastRow">
-      <w:tcPr/>
-    </w:tblStylePr>
-    <w:tblStylePr w:type="neCell">
-      <w:tcPr/>
-    </w:tblStylePr>
-    <w:tblStylePr w:type="nwCell">
-      <w:tcPr/>
-    </w:tblStylePr>
-    <w:tblStylePr w:type="seCell">
-      <w:tcPr/>
-    </w:tblStylePr>
-    <w:tblStylePr w:type="swCell">
-      <w:tcPr/>
-    </w:tblStylePr>
   </w:style>
 </w:styles>
 </file>

</xml_diff>